<commit_message>
docs: regenerate SPECIFICATION.docx for v1.1
Includes new AWS data pipeline section, updated architecture
diagram, environment variables, and project structure.

Co-Authored-By: Claude Sonnet 4.6 <noreply@anthropic.com>
</commit_message>
<xml_diff>
--- a/docs/SPECIFICATION.docx
+++ b/docs/SPECIFICATION.docx
@@ -470,7 +470,7 @@
           <w:color w:val="445566"/>
           <w:sz w:val="24"/>
         </w:rPr>
-        <w:t>Demo Mode</w:t>
+        <w:t>Data Modes</w:t>
       </w:r>
     </w:p>
     <w:p>
@@ -482,22 +482,115 @@
           <w:color w:val="1A1A2E"/>
           <w:sz w:val="20"/>
         </w:rPr>
-        <w:t xml:space="preserve">The platform is designed to function as a </w:t>
-      </w:r>
+        <w:t>The platform supports two data modes, switchable via environment variable:</w:t>
+      </w:r>
+    </w:p>
+    <w:p>
+      <w:pPr>
+        <w:pStyle w:val="ListBullet"/>
+        <w:spacing w:after="40"/>
+        <w:ind w:left="360"/>
+      </w:pPr>
+      <w:r/>
       <w:r>
         <w:rPr>
           <w:b/>
-          <w:color w:val="1A1A2E"/>
-          <w:sz w:val="20"/>
         </w:rPr>
-        <w:t>procurement demonstration system</w:t>
-      </w:r>
+        <w:t>Live mode</w:t>
+      </w:r>
+      <w:r>
+        <w:t xml:space="preserve"> — telemetry is generated in real time by the AWS data pipeline (</w:t>
+      </w:r>
+      <w:r>
+        <w:rPr>
+          <w:rFonts w:ascii="Courier New" w:hAnsi="Courier New"/>
+          <w:color w:val="C7254E"/>
+          <w:sz w:val="18"/>
+        </w:rPr>
+        <w:t>infra/</w:t>
+      </w:r>
+      <w:r>
+        <w:t xml:space="preserve">), stored in DynamoDB, and served to the app via a Lambda Function URL. Set </w:t>
+      </w:r>
+      <w:r>
+        <w:rPr>
+          <w:rFonts w:ascii="Courier New" w:hAnsi="Courier New"/>
+          <w:color w:val="C7254E"/>
+          <w:sz w:val="18"/>
+        </w:rPr>
+        <w:t>NEXT_PUBLIC_AWS_SNAPSHOT_API_URL</w:t>
+      </w:r>
+      <w:r>
+        <w:t xml:space="preserve"> to enable.</w:t>
+      </w:r>
+    </w:p>
+    <w:p>
+      <w:pPr>
+        <w:pStyle w:val="ListBullet"/>
+        <w:spacing w:after="40"/>
+        <w:ind w:left="360"/>
+      </w:pPr>
+      <w:r/>
+      <w:r>
+        <w:rPr>
+          <w:b/>
+        </w:rPr>
+        <w:t>Demo mode</w:t>
+      </w:r>
+      <w:r>
+        <w:t xml:space="preserve"> — all telemetry, incidents, and snapshot data are served from static mock JSON files (</w:t>
+      </w:r>
+      <w:r>
+        <w:rPr>
+          <w:rFonts w:ascii="Courier New" w:hAnsi="Courier New"/>
+          <w:color w:val="C7254E"/>
+          <w:sz w:val="18"/>
+        </w:rPr>
+        <w:t>/public/mock/</w:t>
+      </w:r>
+      <w:r>
+        <w:t>). The demo is deterministic and reproducible, requiring no live sensor infrastructure. This is the default when the env var is not set.</w:t>
+      </w:r>
+    </w:p>
+    <w:p>
+      <w:pPr>
+        <w:spacing w:after="80"/>
+      </w:pPr>
       <w:r>
         <w:rPr>
           <w:color w:val="1A1A2E"/>
           <w:sz w:val="20"/>
         </w:rPr>
-        <w:t xml:space="preserve"> — all telemetry, incidents, and snapshot data are served from static mock JSON files. The demo is deterministic and reproducible, requiring no live sensor infrastructure. Real integrations (Google Maps, OpenAI, Supabase) are live.</w:t>
+      </w:r>
+      <w:r>
+        <w:rPr>
+          <w:rFonts w:ascii="Courier New" w:hAnsi="Courier New"/>
+          <w:color w:val="1A1A2E"/>
+          <w:sz w:val="20"/>
+        </w:rPr>
+        <w:t>loadLiveState()</w:t>
+      </w:r>
+      <w:r>
+        <w:rPr>
+          <w:color w:val="1A1A2E"/>
+          <w:sz w:val="20"/>
+        </w:rPr>
+        <w:t xml:space="preserve"> in </w:t>
+      </w:r>
+      <w:r>
+        <w:rPr>
+          <w:rFonts w:ascii="Courier New" w:hAnsi="Courier New"/>
+          <w:color w:val="1A1A2E"/>
+          <w:sz w:val="20"/>
+        </w:rPr>
+        <w:t>lib/data.ts</w:t>
+      </w:r>
+      <w:r>
+        <w:rPr>
+          <w:color w:val="1A1A2E"/>
+          <w:sz w:val="20"/>
+        </w:rPr>
+        <w:t xml:space="preserve"> checks for the env var and falls back to mock data automatically if the AWS API is unavailable.</w:t>
       </w:r>
     </w:p>
     <w:p>
@@ -1820,6 +1913,145 @@
           </w:p>
         </w:tc>
       </w:tr>
+      <w:tr>
+        <w:tc>
+          <w:tcPr>
+            <w:tcW w:type="dxa" w:w="3041"/>
+            <w:tcBorders>
+              <w:top w:val="single" w:sz="4" w:space="0" w:color="CCCCCC"/>
+              <w:left w:val="single" w:sz="4" w:space="0" w:color="CCCCCC"/>
+              <w:bottom w:val="single" w:sz="4" w:space="0" w:color="CCCCCC"/>
+              <w:right w:val="single" w:sz="4" w:space="0" w:color="CCCCCC"/>
+            </w:tcBorders>
+          </w:tcPr>
+          <w:p>
+            <w:pPr>
+              <w:spacing w:before="40" w:after="40"/>
+            </w:pPr>
+            <w:r>
+              <w:rPr>
+                <w:sz w:val="18"/>
+              </w:rPr>
+              <w:t>Infrastructure-as-Code</w:t>
+            </w:r>
+          </w:p>
+        </w:tc>
+        <w:tc>
+          <w:tcPr>
+            <w:tcW w:type="dxa" w:w="3041"/>
+            <w:tcBorders>
+              <w:top w:val="single" w:sz="4" w:space="0" w:color="CCCCCC"/>
+              <w:left w:val="single" w:sz="4" w:space="0" w:color="CCCCCC"/>
+              <w:bottom w:val="single" w:sz="4" w:space="0" w:color="CCCCCC"/>
+              <w:right w:val="single" w:sz="4" w:space="0" w:color="CCCCCC"/>
+            </w:tcBorders>
+          </w:tcPr>
+          <w:p>
+            <w:pPr>
+              <w:spacing w:before="40" w:after="40"/>
+            </w:pPr>
+            <w:r>
+              <w:rPr>
+                <w:sz w:val="18"/>
+              </w:rPr>
+              <w:t>AWS CDK v2 (TypeScript)</w:t>
+            </w:r>
+          </w:p>
+        </w:tc>
+        <w:tc>
+          <w:tcPr>
+            <w:tcW w:type="dxa" w:w="3041"/>
+            <w:tcBorders>
+              <w:top w:val="single" w:sz="4" w:space="0" w:color="CCCCCC"/>
+              <w:left w:val="single" w:sz="4" w:space="0" w:color="CCCCCC"/>
+              <w:bottom w:val="single" w:sz="4" w:space="0" w:color="CCCCCC"/>
+              <w:right w:val="single" w:sz="4" w:space="0" w:color="CCCCCC"/>
+            </w:tcBorders>
+          </w:tcPr>
+          <w:p>
+            <w:pPr>
+              <w:spacing w:before="40" w:after="40"/>
+            </w:pPr>
+            <w:r>
+              <w:rPr>
+                <w:sz w:val="18"/>
+              </w:rPr>
+              <w:t>2.1108.0</w:t>
+            </w:r>
+          </w:p>
+        </w:tc>
+      </w:tr>
+      <w:tr>
+        <w:tc>
+          <w:tcPr>
+            <w:tcW w:type="dxa" w:w="3041"/>
+            <w:tcBorders>
+              <w:top w:val="single" w:sz="4" w:space="0" w:color="CCCCCC"/>
+              <w:left w:val="single" w:sz="4" w:space="0" w:color="CCCCCC"/>
+              <w:bottom w:val="single" w:sz="4" w:space="0" w:color="CCCCCC"/>
+              <w:right w:val="single" w:sz="4" w:space="0" w:color="CCCCCC"/>
+            </w:tcBorders>
+            <w:shd w:val="clear" w:color="auto" w:fill="F0F4F8"/>
+          </w:tcPr>
+          <w:p>
+            <w:pPr>
+              <w:spacing w:before="40" w:after="40"/>
+            </w:pPr>
+            <w:r>
+              <w:rPr>
+                <w:sz w:val="18"/>
+              </w:rPr>
+              <w:t>Data Pipeline</w:t>
+            </w:r>
+          </w:p>
+        </w:tc>
+        <w:tc>
+          <w:tcPr>
+            <w:tcW w:type="dxa" w:w="3041"/>
+            <w:tcBorders>
+              <w:top w:val="single" w:sz="4" w:space="0" w:color="CCCCCC"/>
+              <w:left w:val="single" w:sz="4" w:space="0" w:color="CCCCCC"/>
+              <w:bottom w:val="single" w:sz="4" w:space="0" w:color="CCCCCC"/>
+              <w:right w:val="single" w:sz="4" w:space="0" w:color="CCCCCC"/>
+            </w:tcBorders>
+            <w:shd w:val="clear" w:color="auto" w:fill="F0F4F8"/>
+          </w:tcPr>
+          <w:p>
+            <w:pPr>
+              <w:spacing w:before="40" w:after="40"/>
+            </w:pPr>
+            <w:r>
+              <w:rPr>
+                <w:sz w:val="18"/>
+              </w:rPr>
+              <w:t>AWS (Kinesis, Firehose, S3, DynamoDB, Lambda, EventBridge)</w:t>
+            </w:r>
+          </w:p>
+        </w:tc>
+        <w:tc>
+          <w:tcPr>
+            <w:tcW w:type="dxa" w:w="3041"/>
+            <w:tcBorders>
+              <w:top w:val="single" w:sz="4" w:space="0" w:color="CCCCCC"/>
+              <w:left w:val="single" w:sz="4" w:space="0" w:color="CCCCCC"/>
+              <w:bottom w:val="single" w:sz="4" w:space="0" w:color="CCCCCC"/>
+              <w:right w:val="single" w:sz="4" w:space="0" w:color="CCCCCC"/>
+            </w:tcBorders>
+            <w:shd w:val="clear" w:color="auto" w:fill="F0F4F8"/>
+          </w:tcPr>
+          <w:p>
+            <w:pPr>
+              <w:spacing w:before="40" w:after="40"/>
+            </w:pPr>
+            <w:r>
+              <w:rPr>
+                <w:sz w:val="18"/>
+              </w:rPr>
+              <w:t>—</w:t>
+            </w:r>
+          </w:p>
+        </w:tc>
+      </w:tr>
     </w:tbl>
     <w:p/>
     <w:p>
@@ -1847,29 +2079,39 @@
           <w:color w:val="2D2D2D"/>
           <w:sz w:val="16"/>
         </w:rPr>
-        <w:t>┌─────────────────────────────────────────────────────┐</w:t>
+        <w:t>┌──────────────────────────────────────────────────────────────┐</w:t>
         <w:br/>
-        <w:t>│                    Browser / Client                  │</w:t>
+        <w:t>│                      Browser / Client                        │</w:t>
         <w:br/>
-        <w:t>│  React Components, Context Providers, useMemo/hooks  │</w:t>
+        <w:t>│   React Components, Context Providers, useMemo/hooks         │</w:t>
         <w:br/>
-        <w:t>├─────────────────────────────────────────────────────┤</w:t>
+        <w:t>├──────────────────────────────────────────────────────────────┤</w:t>
         <w:br/>
-        <w:t>│                  Next.js App Router                  │</w:t>
+        <w:t>│                    Next.js App Router                        │</w:t>
         <w:br/>
-        <w:t>│  Pages (RSC), API Routes, Middleware (route guards)  │</w:t>
+        <w:t>│   Pages (RSC), API Routes, Middleware (route guards)         │</w:t>
         <w:br/>
-        <w:t>├──────────────────────┬──────────────────────────────┤</w:t>
+        <w:t>├───────────────────────┬──────────────────────────────────────┤</w:t>
         <w:br/>
-        <w:t>│   Static Mock Data   │     External Services        │</w:t>
+        <w:t>│   Static Mock Data    │        External Services             │</w:t>
         <w:br/>
-        <w:t>│  /public/mock/*.json │  OpenAI · Google Maps        │</w:t>
+        <w:t>│  /public/mock/*.json  │  OpenAI · Google Maps · Supabase     │</w:t>
         <w:br/>
-        <w:t>│  (Scenarios, Schools │  Supabase (RT + Postgres)    │</w:t>
+        <w:t>│  (Demo / fallback)    ├──────────────────────────────────────┤</w:t>
         <w:br/>
-        <w:t>│   Incidents, Procure)│                              │</w:t>
+        <w:t>│                       │        AWS Data Pipeline             │</w:t>
         <w:br/>
-        <w:t>└──────────────────────┴──────────────────────────────┘</w:t>
+        <w:t>│                       │  EventBridge → Generator Lambda      │</w:t>
+        <w:br/>
+        <w:t>│                       │       → Kinesis Data Stream          │</w:t>
+        <w:br/>
+        <w:t>│                       │       ├── Firehose → S3 Data Lake    │</w:t>
+        <w:br/>
+        <w:t>│                       │       └── Processor Lambda → DynamoDB│</w:t>
+        <w:br/>
+        <w:t>│                       │       ← Snapshot API Lambda          │</w:t>
+        <w:br/>
+        <w:t>└───────────────────────┴──────────────────────────────────────┘</w:t>
       </w:r>
     </w:p>
     <w:p>
@@ -15236,7 +15478,2336 @@
           <w:color w:val="0D7C8F"/>
           <w:sz w:val="28"/>
         </w:rPr>
-        <w:t>8. External Integrations</w:t>
+        <w:t>8. AWS Data Pipeline (`infra/`)</w:t>
+      </w:r>
+    </w:p>
+    <w:p>
+      <w:pPr>
+        <w:spacing w:after="80"/>
+      </w:pPr>
+      <w:r>
+        <w:rPr>
+          <w:color w:val="1A1A2E"/>
+          <w:sz w:val="20"/>
+        </w:rPr>
+        <w:t xml:space="preserve">The </w:t>
+      </w:r>
+      <w:r>
+        <w:rPr>
+          <w:rFonts w:ascii="Courier New" w:hAnsi="Courier New"/>
+          <w:color w:val="1A1A2E"/>
+          <w:sz w:val="20"/>
+        </w:rPr>
+        <w:t>infra/</w:t>
+      </w:r>
+      <w:r>
+        <w:rPr>
+          <w:color w:val="1A1A2E"/>
+          <w:sz w:val="20"/>
+        </w:rPr>
+        <w:t xml:space="preserve"> directory contains a CDK v2 TypeScript project that provisions a real-time traffic data generation and storage pipeline on AWS. It is optional — the app falls back to static mock data when not configured.</w:t>
+      </w:r>
+    </w:p>
+    <w:p>
+      <w:pPr>
+        <w:pStyle w:val="Heading3"/>
+      </w:pPr>
+      <w:r>
+        <w:rPr>
+          <w:b/>
+          <w:color w:val="445566"/>
+          <w:sz w:val="24"/>
+        </w:rPr>
+        <w:t>Pipeline Overview</w:t>
+      </w:r>
+    </w:p>
+    <w:p>
+      <w:pPr>
+        <w:spacing w:before="80" w:after="80"/>
+        <w:ind w:left="576"/>
+        <w:shd w:val="clear" w:color="auto" w:fill="F3F4F6"/>
+      </w:pPr>
+      <w:r>
+        <w:rPr>
+          <w:rFonts w:ascii="Courier New" w:hAnsi="Courier New"/>
+          <w:color w:val="2D2D2D"/>
+          <w:sz w:val="16"/>
+        </w:rPr>
+        <w:t>EventBridge Scheduler (every 60s)</w:t>
+        <w:br/>
+        <w:t xml:space="preserve">    │</w:t>
+        <w:br/>
+        <w:t xml:space="preserve">    ▼</w:t>
+        <w:br/>
+        <w:t>Generator Lambda              — Gaussian traffic model for all 11 zones</w:t>
+        <w:br/>
+        <w:t xml:space="preserve">    │</w:t>
+        <w:br/>
+        <w:t xml:space="preserve">    ▼</w:t>
+        <w:br/>
+        <w:t>Kinesis Data Stream</w:t>
+        <w:br/>
+        <w:t xml:space="preserve">    ├── Kinesis Firehose ──► S3 Data Lake    (cold path, Athena-queryable)</w:t>
+        <w:br/>
+        <w:t xml:space="preserve">    └── Processor Lambda ──► DynamoDB        (hot path, latest state per zone)</w:t>
+        <w:br/>
+        <w:t xml:space="preserve">                                 │</w:t>
+        <w:br/>
+        <w:t xml:space="preserve">                            Snapshot API Lambda</w:t>
+        <w:br/>
+        <w:t xml:space="preserve">                                 │</w:t>
+        <w:br/>
+        <w:t xml:space="preserve">                            Lambda Function URL (HTTPS, CORS-enabled)</w:t>
+        <w:br/>
+        <w:t xml:space="preserve">                                 │</w:t>
+        <w:br/>
+        <w:t xml:space="preserve">                         Next.js app (via NEXT_PUBLIC_AWS_SNAPSHOT_API_URL)</w:t>
+      </w:r>
+    </w:p>
+    <w:p>
+      <w:pPr>
+        <w:pStyle w:val="Heading3"/>
+      </w:pPr>
+      <w:r>
+        <w:rPr>
+          <w:b/>
+          <w:color w:val="445566"/>
+          <w:sz w:val="24"/>
+        </w:rPr>
+        <w:t>AWS Resources</w:t>
+      </w:r>
+    </w:p>
+    <w:tbl>
+      <w:tblPr>
+        <w:tblStyle w:val="TableGrid"/>
+        <w:tblW w:type="auto" w:w="0"/>
+        <w:tblLook w:firstColumn="1" w:firstRow="1" w:lastColumn="0" w:lastRow="0" w:noHBand="0" w:noVBand="1" w:val="04A0"/>
+      </w:tblPr>
+      <w:tblGrid>
+        <w:gridCol w:w="3041"/>
+        <w:gridCol w:w="3041"/>
+        <w:gridCol w:w="3041"/>
+      </w:tblGrid>
+      <w:tr>
+        <w:tc>
+          <w:tcPr>
+            <w:tcW w:type="dxa" w:w="3041"/>
+            <w:tcBorders>
+              <w:top w:val="single" w:sz="4" w:space="0" w:color="CCCCCC"/>
+              <w:left w:val="single" w:sz="4" w:space="0" w:color="CCCCCC"/>
+              <w:bottom w:val="single" w:sz="4" w:space="0" w:color="CCCCCC"/>
+              <w:right w:val="single" w:sz="4" w:space="0" w:color="CCCCCC"/>
+            </w:tcBorders>
+            <w:shd w:val="clear" w:color="auto" w:fill="1E3A5F"/>
+          </w:tcPr>
+          <w:p>
+            <w:pPr>
+              <w:spacing w:before="40" w:after="40"/>
+            </w:pPr>
+            <w:r>
+              <w:rPr>
+                <w:b/>
+                <w:color w:val="FFFFFF"/>
+                <w:sz w:val="18"/>
+              </w:rPr>
+              <w:t>Resource</w:t>
+            </w:r>
+          </w:p>
+        </w:tc>
+        <w:tc>
+          <w:tcPr>
+            <w:tcW w:type="dxa" w:w="3041"/>
+            <w:tcBorders>
+              <w:top w:val="single" w:sz="4" w:space="0" w:color="CCCCCC"/>
+              <w:left w:val="single" w:sz="4" w:space="0" w:color="CCCCCC"/>
+              <w:bottom w:val="single" w:sz="4" w:space="0" w:color="CCCCCC"/>
+              <w:right w:val="single" w:sz="4" w:space="0" w:color="CCCCCC"/>
+            </w:tcBorders>
+            <w:shd w:val="clear" w:color="auto" w:fill="1E3A5F"/>
+          </w:tcPr>
+          <w:p>
+            <w:pPr>
+              <w:spacing w:before="40" w:after="40"/>
+            </w:pPr>
+            <w:r>
+              <w:rPr>
+                <w:b/>
+                <w:color w:val="FFFFFF"/>
+                <w:sz w:val="18"/>
+              </w:rPr>
+              <w:t>Name</w:t>
+            </w:r>
+          </w:p>
+        </w:tc>
+        <w:tc>
+          <w:tcPr>
+            <w:tcW w:type="dxa" w:w="3041"/>
+            <w:tcBorders>
+              <w:top w:val="single" w:sz="4" w:space="0" w:color="CCCCCC"/>
+              <w:left w:val="single" w:sz="4" w:space="0" w:color="CCCCCC"/>
+              <w:bottom w:val="single" w:sz="4" w:space="0" w:color="CCCCCC"/>
+              <w:right w:val="single" w:sz="4" w:space="0" w:color="CCCCCC"/>
+            </w:tcBorders>
+            <w:shd w:val="clear" w:color="auto" w:fill="1E3A5F"/>
+          </w:tcPr>
+          <w:p>
+            <w:pPr>
+              <w:spacing w:before="40" w:after="40"/>
+            </w:pPr>
+            <w:r>
+              <w:rPr>
+                <w:b/>
+                <w:color w:val="FFFFFF"/>
+                <w:sz w:val="18"/>
+              </w:rPr>
+              <w:t>Purpose</w:t>
+            </w:r>
+          </w:p>
+        </w:tc>
+      </w:tr>
+      <w:tr>
+        <w:tc>
+          <w:tcPr>
+            <w:tcW w:type="dxa" w:w="3041"/>
+            <w:tcBorders>
+              <w:top w:val="single" w:sz="4" w:space="0" w:color="CCCCCC"/>
+              <w:left w:val="single" w:sz="4" w:space="0" w:color="CCCCCC"/>
+              <w:bottom w:val="single" w:sz="4" w:space="0" w:color="CCCCCC"/>
+              <w:right w:val="single" w:sz="4" w:space="0" w:color="CCCCCC"/>
+            </w:tcBorders>
+          </w:tcPr>
+          <w:p>
+            <w:pPr>
+              <w:spacing w:before="40" w:after="40"/>
+            </w:pPr>
+            <w:r>
+              <w:rPr>
+                <w:sz w:val="18"/>
+              </w:rPr>
+              <w:t>EventBridge Rule</w:t>
+            </w:r>
+          </w:p>
+        </w:tc>
+        <w:tc>
+          <w:tcPr>
+            <w:tcW w:type="dxa" w:w="3041"/>
+            <w:tcBorders>
+              <w:top w:val="single" w:sz="4" w:space="0" w:color="CCCCCC"/>
+              <w:left w:val="single" w:sz="4" w:space="0" w:color="CCCCCC"/>
+              <w:bottom w:val="single" w:sz="4" w:space="0" w:color="CCCCCC"/>
+              <w:right w:val="single" w:sz="4" w:space="0" w:color="CCCCCC"/>
+            </w:tcBorders>
+          </w:tcPr>
+          <w:p>
+            <w:pPr>
+              <w:spacing w:before="40" w:after="40"/>
+            </w:pPr>
+            <w:r>
+              <w:rPr>
+                <w:sz w:val="18"/>
+              </w:rPr>
+              <w:t>schoolzone-generator-schedule</w:t>
+            </w:r>
+          </w:p>
+        </w:tc>
+        <w:tc>
+          <w:tcPr>
+            <w:tcW w:type="dxa" w:w="3041"/>
+            <w:tcBorders>
+              <w:top w:val="single" w:sz="4" w:space="0" w:color="CCCCCC"/>
+              <w:left w:val="single" w:sz="4" w:space="0" w:color="CCCCCC"/>
+              <w:bottom w:val="single" w:sz="4" w:space="0" w:color="CCCCCC"/>
+              <w:right w:val="single" w:sz="4" w:space="0" w:color="CCCCCC"/>
+            </w:tcBorders>
+          </w:tcPr>
+          <w:p>
+            <w:pPr>
+              <w:spacing w:before="40" w:after="40"/>
+            </w:pPr>
+            <w:r>
+              <w:rPr>
+                <w:sz w:val="18"/>
+              </w:rPr>
+              <w:t>Triggers generator every 60 seconds</w:t>
+            </w:r>
+          </w:p>
+        </w:tc>
+      </w:tr>
+      <w:tr>
+        <w:tc>
+          <w:tcPr>
+            <w:tcW w:type="dxa" w:w="3041"/>
+            <w:tcBorders>
+              <w:top w:val="single" w:sz="4" w:space="0" w:color="CCCCCC"/>
+              <w:left w:val="single" w:sz="4" w:space="0" w:color="CCCCCC"/>
+              <w:bottom w:val="single" w:sz="4" w:space="0" w:color="CCCCCC"/>
+              <w:right w:val="single" w:sz="4" w:space="0" w:color="CCCCCC"/>
+            </w:tcBorders>
+            <w:shd w:val="clear" w:color="auto" w:fill="F0F4F8"/>
+          </w:tcPr>
+          <w:p>
+            <w:pPr>
+              <w:spacing w:before="40" w:after="40"/>
+            </w:pPr>
+            <w:r>
+              <w:rPr>
+                <w:sz w:val="18"/>
+              </w:rPr>
+              <w:t>Lambda</w:t>
+            </w:r>
+          </w:p>
+        </w:tc>
+        <w:tc>
+          <w:tcPr>
+            <w:tcW w:type="dxa" w:w="3041"/>
+            <w:tcBorders>
+              <w:top w:val="single" w:sz="4" w:space="0" w:color="CCCCCC"/>
+              <w:left w:val="single" w:sz="4" w:space="0" w:color="CCCCCC"/>
+              <w:bottom w:val="single" w:sz="4" w:space="0" w:color="CCCCCC"/>
+              <w:right w:val="single" w:sz="4" w:space="0" w:color="CCCCCC"/>
+            </w:tcBorders>
+            <w:shd w:val="clear" w:color="auto" w:fill="F0F4F8"/>
+          </w:tcPr>
+          <w:p>
+            <w:pPr>
+              <w:spacing w:before="40" w:after="40"/>
+            </w:pPr>
+            <w:r>
+              <w:rPr>
+                <w:sz w:val="18"/>
+              </w:rPr>
+              <w:t>schoolzone-generator</w:t>
+            </w:r>
+          </w:p>
+        </w:tc>
+        <w:tc>
+          <w:tcPr>
+            <w:tcW w:type="dxa" w:w="3041"/>
+            <w:tcBorders>
+              <w:top w:val="single" w:sz="4" w:space="0" w:color="CCCCCC"/>
+              <w:left w:val="single" w:sz="4" w:space="0" w:color="CCCCCC"/>
+              <w:bottom w:val="single" w:sz="4" w:space="0" w:color="CCCCCC"/>
+              <w:right w:val="single" w:sz="4" w:space="0" w:color="CCCCCC"/>
+            </w:tcBorders>
+            <w:shd w:val="clear" w:color="auto" w:fill="F0F4F8"/>
+          </w:tcPr>
+          <w:p>
+            <w:pPr>
+              <w:spacing w:before="40" w:after="40"/>
+            </w:pPr>
+            <w:r>
+              <w:rPr>
+                <w:sz w:val="18"/>
+              </w:rPr>
+              <w:t>Computes zone telemetry, publishes to Kinesis</w:t>
+            </w:r>
+          </w:p>
+        </w:tc>
+      </w:tr>
+      <w:tr>
+        <w:tc>
+          <w:tcPr>
+            <w:tcW w:type="dxa" w:w="3041"/>
+            <w:tcBorders>
+              <w:top w:val="single" w:sz="4" w:space="0" w:color="CCCCCC"/>
+              <w:left w:val="single" w:sz="4" w:space="0" w:color="CCCCCC"/>
+              <w:bottom w:val="single" w:sz="4" w:space="0" w:color="CCCCCC"/>
+              <w:right w:val="single" w:sz="4" w:space="0" w:color="CCCCCC"/>
+            </w:tcBorders>
+          </w:tcPr>
+          <w:p>
+            <w:pPr>
+              <w:spacing w:before="40" w:after="40"/>
+            </w:pPr>
+            <w:r>
+              <w:rPr>
+                <w:sz w:val="18"/>
+              </w:rPr>
+              <w:t>Kinesis Data Stream</w:t>
+            </w:r>
+          </w:p>
+        </w:tc>
+        <w:tc>
+          <w:tcPr>
+            <w:tcW w:type="dxa" w:w="3041"/>
+            <w:tcBorders>
+              <w:top w:val="single" w:sz="4" w:space="0" w:color="CCCCCC"/>
+              <w:left w:val="single" w:sz="4" w:space="0" w:color="CCCCCC"/>
+              <w:bottom w:val="single" w:sz="4" w:space="0" w:color="CCCCCC"/>
+              <w:right w:val="single" w:sz="4" w:space="0" w:color="CCCCCC"/>
+            </w:tcBorders>
+          </w:tcPr>
+          <w:p>
+            <w:pPr>
+              <w:spacing w:before="40" w:after="40"/>
+            </w:pPr>
+            <w:r>
+              <w:rPr>
+                <w:sz w:val="18"/>
+              </w:rPr>
+              <w:t>schoolzone-traffic</w:t>
+            </w:r>
+          </w:p>
+        </w:tc>
+        <w:tc>
+          <w:tcPr>
+            <w:tcW w:type="dxa" w:w="3041"/>
+            <w:tcBorders>
+              <w:top w:val="single" w:sz="4" w:space="0" w:color="CCCCCC"/>
+              <w:left w:val="single" w:sz="4" w:space="0" w:color="CCCCCC"/>
+              <w:bottom w:val="single" w:sz="4" w:space="0" w:color="CCCCCC"/>
+              <w:right w:val="single" w:sz="4" w:space="0" w:color="CCCCCC"/>
+            </w:tcBorders>
+          </w:tcPr>
+          <w:p>
+            <w:pPr>
+              <w:spacing w:before="40" w:after="40"/>
+            </w:pPr>
+            <w:r>
+              <w:rPr>
+                <w:sz w:val="18"/>
+              </w:rPr>
+              <w:t>Real-time telemetry transport (1 shard, 24h retention)</w:t>
+            </w:r>
+          </w:p>
+        </w:tc>
+      </w:tr>
+      <w:tr>
+        <w:tc>
+          <w:tcPr>
+            <w:tcW w:type="dxa" w:w="3041"/>
+            <w:tcBorders>
+              <w:top w:val="single" w:sz="4" w:space="0" w:color="CCCCCC"/>
+              <w:left w:val="single" w:sz="4" w:space="0" w:color="CCCCCC"/>
+              <w:bottom w:val="single" w:sz="4" w:space="0" w:color="CCCCCC"/>
+              <w:right w:val="single" w:sz="4" w:space="0" w:color="CCCCCC"/>
+            </w:tcBorders>
+            <w:shd w:val="clear" w:color="auto" w:fill="F0F4F8"/>
+          </w:tcPr>
+          <w:p>
+            <w:pPr>
+              <w:spacing w:before="40" w:after="40"/>
+            </w:pPr>
+            <w:r>
+              <w:rPr>
+                <w:sz w:val="18"/>
+              </w:rPr>
+              <w:t>Kinesis Firehose</w:t>
+            </w:r>
+          </w:p>
+        </w:tc>
+        <w:tc>
+          <w:tcPr>
+            <w:tcW w:type="dxa" w:w="3041"/>
+            <w:tcBorders>
+              <w:top w:val="single" w:sz="4" w:space="0" w:color="CCCCCC"/>
+              <w:left w:val="single" w:sz="4" w:space="0" w:color="CCCCCC"/>
+              <w:bottom w:val="single" w:sz="4" w:space="0" w:color="CCCCCC"/>
+              <w:right w:val="single" w:sz="4" w:space="0" w:color="CCCCCC"/>
+            </w:tcBorders>
+            <w:shd w:val="clear" w:color="auto" w:fill="F0F4F8"/>
+          </w:tcPr>
+          <w:p>
+            <w:pPr>
+              <w:spacing w:before="40" w:after="40"/>
+            </w:pPr>
+            <w:r>
+              <w:rPr>
+                <w:sz w:val="18"/>
+              </w:rPr>
+              <w:t>schoolzone-to-datalake</w:t>
+            </w:r>
+          </w:p>
+        </w:tc>
+        <w:tc>
+          <w:tcPr>
+            <w:tcW w:type="dxa" w:w="3041"/>
+            <w:tcBorders>
+              <w:top w:val="single" w:sz="4" w:space="0" w:color="CCCCCC"/>
+              <w:left w:val="single" w:sz="4" w:space="0" w:color="CCCCCC"/>
+              <w:bottom w:val="single" w:sz="4" w:space="0" w:color="CCCCCC"/>
+              <w:right w:val="single" w:sz="4" w:space="0" w:color="CCCCCC"/>
+            </w:tcBorders>
+            <w:shd w:val="clear" w:color="auto" w:fill="F0F4F8"/>
+          </w:tcPr>
+          <w:p>
+            <w:pPr>
+              <w:spacing w:before="40" w:after="40"/>
+            </w:pPr>
+            <w:r>
+              <w:rPr>
+                <w:sz w:val="18"/>
+              </w:rPr>
+              <w:t>Buffers stream → S3 (60s/5MB, GZIP, date-partitioned)</w:t>
+            </w:r>
+          </w:p>
+        </w:tc>
+      </w:tr>
+      <w:tr>
+        <w:tc>
+          <w:tcPr>
+            <w:tcW w:type="dxa" w:w="3041"/>
+            <w:tcBorders>
+              <w:top w:val="single" w:sz="4" w:space="0" w:color="CCCCCC"/>
+              <w:left w:val="single" w:sz="4" w:space="0" w:color="CCCCCC"/>
+              <w:bottom w:val="single" w:sz="4" w:space="0" w:color="CCCCCC"/>
+              <w:right w:val="single" w:sz="4" w:space="0" w:color="CCCCCC"/>
+            </w:tcBorders>
+          </w:tcPr>
+          <w:p>
+            <w:pPr>
+              <w:spacing w:before="40" w:after="40"/>
+            </w:pPr>
+            <w:r>
+              <w:rPr>
+                <w:sz w:val="18"/>
+              </w:rPr>
+              <w:t>S3 Bucket</w:t>
+            </w:r>
+          </w:p>
+        </w:tc>
+        <w:tc>
+          <w:tcPr>
+            <w:tcW w:type="dxa" w:w="3041"/>
+            <w:tcBorders>
+              <w:top w:val="single" w:sz="4" w:space="0" w:color="CCCCCC"/>
+              <w:left w:val="single" w:sz="4" w:space="0" w:color="CCCCCC"/>
+              <w:bottom w:val="single" w:sz="4" w:space="0" w:color="CCCCCC"/>
+              <w:right w:val="single" w:sz="4" w:space="0" w:color="CCCCCC"/>
+            </w:tcBorders>
+          </w:tcPr>
+          <w:p>
+            <w:pPr>
+              <w:spacing w:before="40" w:after="40"/>
+            </w:pPr>
+            <w:r>
+              <w:rPr>
+                <w:sz w:val="18"/>
+              </w:rPr>
+              <w:t>schoolzone-datalake-&lt;account&gt;-&lt;region&gt;</w:t>
+            </w:r>
+          </w:p>
+        </w:tc>
+        <w:tc>
+          <w:tcPr>
+            <w:tcW w:type="dxa" w:w="3041"/>
+            <w:tcBorders>
+              <w:top w:val="single" w:sz="4" w:space="0" w:color="CCCCCC"/>
+              <w:left w:val="single" w:sz="4" w:space="0" w:color="CCCCCC"/>
+              <w:bottom w:val="single" w:sz="4" w:space="0" w:color="CCCCCC"/>
+              <w:right w:val="single" w:sz="4" w:space="0" w:color="CCCCCC"/>
+            </w:tcBorders>
+          </w:tcPr>
+          <w:p>
+            <w:pPr>
+              <w:spacing w:before="40" w:after="40"/>
+            </w:pPr>
+            <w:r>
+              <w:rPr>
+                <w:sz w:val="18"/>
+              </w:rPr>
+              <w:t>Data lake (IA at 30d, Glacier at 90d)</w:t>
+            </w:r>
+          </w:p>
+        </w:tc>
+      </w:tr>
+      <w:tr>
+        <w:tc>
+          <w:tcPr>
+            <w:tcW w:type="dxa" w:w="3041"/>
+            <w:tcBorders>
+              <w:top w:val="single" w:sz="4" w:space="0" w:color="CCCCCC"/>
+              <w:left w:val="single" w:sz="4" w:space="0" w:color="CCCCCC"/>
+              <w:bottom w:val="single" w:sz="4" w:space="0" w:color="CCCCCC"/>
+              <w:right w:val="single" w:sz="4" w:space="0" w:color="CCCCCC"/>
+            </w:tcBorders>
+            <w:shd w:val="clear" w:color="auto" w:fill="F0F4F8"/>
+          </w:tcPr>
+          <w:p>
+            <w:pPr>
+              <w:spacing w:before="40" w:after="40"/>
+            </w:pPr>
+            <w:r>
+              <w:rPr>
+                <w:sz w:val="18"/>
+              </w:rPr>
+              <w:t>DynamoDB Table</w:t>
+            </w:r>
+          </w:p>
+        </w:tc>
+        <w:tc>
+          <w:tcPr>
+            <w:tcW w:type="dxa" w:w="3041"/>
+            <w:tcBorders>
+              <w:top w:val="single" w:sz="4" w:space="0" w:color="CCCCCC"/>
+              <w:left w:val="single" w:sz="4" w:space="0" w:color="CCCCCC"/>
+              <w:bottom w:val="single" w:sz="4" w:space="0" w:color="CCCCCC"/>
+              <w:right w:val="single" w:sz="4" w:space="0" w:color="CCCCCC"/>
+            </w:tcBorders>
+            <w:shd w:val="clear" w:color="auto" w:fill="F0F4F8"/>
+          </w:tcPr>
+          <w:p>
+            <w:pPr>
+              <w:spacing w:before="40" w:after="40"/>
+            </w:pPr>
+            <w:r>
+              <w:rPr>
+                <w:sz w:val="18"/>
+              </w:rPr>
+              <w:t>schoolzone-zone-state</w:t>
+            </w:r>
+          </w:p>
+        </w:tc>
+        <w:tc>
+          <w:tcPr>
+            <w:tcW w:type="dxa" w:w="3041"/>
+            <w:tcBorders>
+              <w:top w:val="single" w:sz="4" w:space="0" w:color="CCCCCC"/>
+              <w:left w:val="single" w:sz="4" w:space="0" w:color="CCCCCC"/>
+              <w:bottom w:val="single" w:sz="4" w:space="0" w:color="CCCCCC"/>
+              <w:right w:val="single" w:sz="4" w:space="0" w:color="CCCCCC"/>
+            </w:tcBorders>
+            <w:shd w:val="clear" w:color="auto" w:fill="F0F4F8"/>
+          </w:tcPr>
+          <w:p>
+            <w:pPr>
+              <w:spacing w:before="40" w:after="40"/>
+            </w:pPr>
+            <w:r>
+              <w:rPr>
+                <w:sz w:val="18"/>
+              </w:rPr>
+              <w:t>Latest zone telemetry per city/zone; 10-min TTL</w:t>
+            </w:r>
+          </w:p>
+        </w:tc>
+      </w:tr>
+      <w:tr>
+        <w:tc>
+          <w:tcPr>
+            <w:tcW w:type="dxa" w:w="3041"/>
+            <w:tcBorders>
+              <w:top w:val="single" w:sz="4" w:space="0" w:color="CCCCCC"/>
+              <w:left w:val="single" w:sz="4" w:space="0" w:color="CCCCCC"/>
+              <w:bottom w:val="single" w:sz="4" w:space="0" w:color="CCCCCC"/>
+              <w:right w:val="single" w:sz="4" w:space="0" w:color="CCCCCC"/>
+            </w:tcBorders>
+          </w:tcPr>
+          <w:p>
+            <w:pPr>
+              <w:spacing w:before="40" w:after="40"/>
+            </w:pPr>
+            <w:r>
+              <w:rPr>
+                <w:sz w:val="18"/>
+              </w:rPr>
+              <w:t>Lambda</w:t>
+            </w:r>
+          </w:p>
+        </w:tc>
+        <w:tc>
+          <w:tcPr>
+            <w:tcW w:type="dxa" w:w="3041"/>
+            <w:tcBorders>
+              <w:top w:val="single" w:sz="4" w:space="0" w:color="CCCCCC"/>
+              <w:left w:val="single" w:sz="4" w:space="0" w:color="CCCCCC"/>
+              <w:bottom w:val="single" w:sz="4" w:space="0" w:color="CCCCCC"/>
+              <w:right w:val="single" w:sz="4" w:space="0" w:color="CCCCCC"/>
+            </w:tcBorders>
+          </w:tcPr>
+          <w:p>
+            <w:pPr>
+              <w:spacing w:before="40" w:after="40"/>
+            </w:pPr>
+            <w:r>
+              <w:rPr>
+                <w:sz w:val="18"/>
+              </w:rPr>
+              <w:t>schoolzone-processor</w:t>
+            </w:r>
+          </w:p>
+        </w:tc>
+        <w:tc>
+          <w:tcPr>
+            <w:tcW w:type="dxa" w:w="3041"/>
+            <w:tcBorders>
+              <w:top w:val="single" w:sz="4" w:space="0" w:color="CCCCCC"/>
+              <w:left w:val="single" w:sz="4" w:space="0" w:color="CCCCCC"/>
+              <w:bottom w:val="single" w:sz="4" w:space="0" w:color="CCCCCC"/>
+              <w:right w:val="single" w:sz="4" w:space="0" w:color="CCCCCC"/>
+            </w:tcBorders>
+          </w:tcPr>
+          <w:p>
+            <w:pPr>
+              <w:spacing w:before="40" w:after="40"/>
+            </w:pPr>
+            <w:r>
+              <w:rPr>
+                <w:sz w:val="18"/>
+              </w:rPr>
+              <w:t>Kinesis → DynamoDB writer</w:t>
+            </w:r>
+          </w:p>
+        </w:tc>
+      </w:tr>
+      <w:tr>
+        <w:tc>
+          <w:tcPr>
+            <w:tcW w:type="dxa" w:w="3041"/>
+            <w:tcBorders>
+              <w:top w:val="single" w:sz="4" w:space="0" w:color="CCCCCC"/>
+              <w:left w:val="single" w:sz="4" w:space="0" w:color="CCCCCC"/>
+              <w:bottom w:val="single" w:sz="4" w:space="0" w:color="CCCCCC"/>
+              <w:right w:val="single" w:sz="4" w:space="0" w:color="CCCCCC"/>
+            </w:tcBorders>
+            <w:shd w:val="clear" w:color="auto" w:fill="F0F4F8"/>
+          </w:tcPr>
+          <w:p>
+            <w:pPr>
+              <w:spacing w:before="40" w:after="40"/>
+            </w:pPr>
+            <w:r>
+              <w:rPr>
+                <w:sz w:val="18"/>
+              </w:rPr>
+              <w:t>Lambda</w:t>
+            </w:r>
+          </w:p>
+        </w:tc>
+        <w:tc>
+          <w:tcPr>
+            <w:tcW w:type="dxa" w:w="3041"/>
+            <w:tcBorders>
+              <w:top w:val="single" w:sz="4" w:space="0" w:color="CCCCCC"/>
+              <w:left w:val="single" w:sz="4" w:space="0" w:color="CCCCCC"/>
+              <w:bottom w:val="single" w:sz="4" w:space="0" w:color="CCCCCC"/>
+              <w:right w:val="single" w:sz="4" w:space="0" w:color="CCCCCC"/>
+            </w:tcBorders>
+            <w:shd w:val="clear" w:color="auto" w:fill="F0F4F8"/>
+          </w:tcPr>
+          <w:p>
+            <w:pPr>
+              <w:spacing w:before="40" w:after="40"/>
+            </w:pPr>
+            <w:r>
+              <w:rPr>
+                <w:sz w:val="18"/>
+              </w:rPr>
+              <w:t>schoolzone-snapshot-api</w:t>
+            </w:r>
+          </w:p>
+        </w:tc>
+        <w:tc>
+          <w:tcPr>
+            <w:tcW w:type="dxa" w:w="3041"/>
+            <w:tcBorders>
+              <w:top w:val="single" w:sz="4" w:space="0" w:color="CCCCCC"/>
+              <w:left w:val="single" w:sz="4" w:space="0" w:color="CCCCCC"/>
+              <w:bottom w:val="single" w:sz="4" w:space="0" w:color="CCCCCC"/>
+              <w:right w:val="single" w:sz="4" w:space="0" w:color="CCCCCC"/>
+            </w:tcBorders>
+            <w:shd w:val="clear" w:color="auto" w:fill="F0F4F8"/>
+          </w:tcPr>
+          <w:p>
+            <w:pPr>
+              <w:spacing w:before="40" w:after="40"/>
+            </w:pPr>
+            <w:r>
+              <w:rPr>
+                <w:sz w:val="18"/>
+              </w:rPr>
+              <w:t>Serves LiveState JSON to the Next.js app</w:t>
+            </w:r>
+          </w:p>
+        </w:tc>
+      </w:tr>
+      <w:tr>
+        <w:tc>
+          <w:tcPr>
+            <w:tcW w:type="dxa" w:w="3041"/>
+            <w:tcBorders>
+              <w:top w:val="single" w:sz="4" w:space="0" w:color="CCCCCC"/>
+              <w:left w:val="single" w:sz="4" w:space="0" w:color="CCCCCC"/>
+              <w:bottom w:val="single" w:sz="4" w:space="0" w:color="CCCCCC"/>
+              <w:right w:val="single" w:sz="4" w:space="0" w:color="CCCCCC"/>
+            </w:tcBorders>
+          </w:tcPr>
+          <w:p>
+            <w:pPr>
+              <w:spacing w:before="40" w:after="40"/>
+            </w:pPr>
+            <w:r>
+              <w:rPr>
+                <w:sz w:val="18"/>
+              </w:rPr>
+              <w:t>Lambda Function URL</w:t>
+            </w:r>
+          </w:p>
+        </w:tc>
+        <w:tc>
+          <w:tcPr>
+            <w:tcW w:type="dxa" w:w="3041"/>
+            <w:tcBorders>
+              <w:top w:val="single" w:sz="4" w:space="0" w:color="CCCCCC"/>
+              <w:left w:val="single" w:sz="4" w:space="0" w:color="CCCCCC"/>
+              <w:bottom w:val="single" w:sz="4" w:space="0" w:color="CCCCCC"/>
+              <w:right w:val="single" w:sz="4" w:space="0" w:color="CCCCCC"/>
+            </w:tcBorders>
+          </w:tcPr>
+          <w:p>
+            <w:pPr>
+              <w:spacing w:before="40" w:after="40"/>
+            </w:pPr>
+            <w:r>
+              <w:rPr>
+                <w:sz w:val="18"/>
+              </w:rPr>
+              <w:t>—</w:t>
+            </w:r>
+          </w:p>
+        </w:tc>
+        <w:tc>
+          <w:tcPr>
+            <w:tcW w:type="dxa" w:w="3041"/>
+            <w:tcBorders>
+              <w:top w:val="single" w:sz="4" w:space="0" w:color="CCCCCC"/>
+              <w:left w:val="single" w:sz="4" w:space="0" w:color="CCCCCC"/>
+              <w:bottom w:val="single" w:sz="4" w:space="0" w:color="CCCCCC"/>
+              <w:right w:val="single" w:sz="4" w:space="0" w:color="CCCCCC"/>
+            </w:tcBorders>
+          </w:tcPr>
+          <w:p>
+            <w:pPr>
+              <w:spacing w:before="40" w:after="40"/>
+            </w:pPr>
+            <w:r>
+              <w:rPr>
+                <w:sz w:val="18"/>
+              </w:rPr>
+              <w:t>HTTPS endpoint for the snapshot API</w:t>
+            </w:r>
+          </w:p>
+        </w:tc>
+      </w:tr>
+    </w:tbl>
+    <w:p/>
+    <w:p>
+      <w:pPr>
+        <w:pStyle w:val="Heading3"/>
+      </w:pPr>
+      <w:r>
+        <w:rPr>
+          <w:b/>
+          <w:color w:val="445566"/>
+          <w:sz w:val="24"/>
+        </w:rPr>
+        <w:t>Generator Traffic Model</w:t>
+      </w:r>
+    </w:p>
+    <w:p>
+      <w:pPr>
+        <w:spacing w:after="80"/>
+      </w:pPr>
+      <w:r>
+        <w:rPr>
+          <w:color w:val="1A1A2E"/>
+          <w:sz w:val="20"/>
+        </w:rPr>
+        <w:t>The Generator Lambda runs the same probabilistic model as the front-end congestion engine:</w:t>
+      </w:r>
+    </w:p>
+    <w:p>
+      <w:pPr>
+        <w:pStyle w:val="ListBullet"/>
+        <w:spacing w:after="40"/>
+        <w:ind w:left="360"/>
+      </w:pPr>
+      <w:r/>
+      <w:r>
+        <w:rPr>
+          <w:b/>
+        </w:rPr>
+        <w:t>Vehicle count</w:t>
+      </w:r>
+      <w:r>
+        <w:t xml:space="preserve"> — Gaussian peaks at dismissal time (school-type dependent) and morning drop-off (7:45 AM), scaled by enrollment × 65% pick-up rate</w:t>
+      </w:r>
+    </w:p>
+    <w:p>
+      <w:pPr>
+        <w:pStyle w:val="ListBullet"/>
+        <w:spacing w:after="40"/>
+        <w:ind w:left="360"/>
+      </w:pPr>
+      <w:r/>
+      <w:r>
+        <w:rPr>
+          <w:b/>
+        </w:rPr>
+        <w:t>Dismissal times</w:t>
+      </w:r>
+      <w:r>
+        <w:t xml:space="preserve"> — Elementary 3:00 PM, Middle 3:15 PM, High 3:30 PM</w:t>
+      </w:r>
+    </w:p>
+    <w:p>
+      <w:pPr>
+        <w:pStyle w:val="ListBullet"/>
+        <w:spacing w:after="40"/>
+        <w:ind w:left="360"/>
+      </w:pPr>
+      <w:r/>
+      <w:r>
+        <w:rPr>
+          <w:b/>
+        </w:rPr>
+        <w:t>Speed</w:t>
+      </w:r>
+      <w:r>
+        <w:t xml:space="preserve"> — 25 mph free-flow, reduced by congestion (up to −15 mph) and weather</w:t>
+      </w:r>
+    </w:p>
+    <w:p>
+      <w:pPr>
+        <w:pStyle w:val="ListBullet"/>
+        <w:spacing w:after="40"/>
+        <w:ind w:left="360"/>
+      </w:pPr>
+      <w:r/>
+      <w:r>
+        <w:rPr>
+          <w:b/>
+        </w:rPr>
+        <w:t>Pedestrian count</w:t>
+      </w:r>
+      <w:r>
+        <w:t xml:space="preserve"> — Gaussian peak at dismissal, scaled by enrollment × 35%</w:t>
+      </w:r>
+    </w:p>
+    <w:p>
+      <w:pPr>
+        <w:pStyle w:val="ListBullet"/>
+        <w:spacing w:after="40"/>
+        <w:ind w:left="360"/>
+      </w:pPr>
+      <w:r/>
+      <w:r>
+        <w:rPr>
+          <w:b/>
+        </w:rPr>
+        <w:t>Risk score</w:t>
+      </w:r>
+      <w:r>
+        <w:t xml:space="preserve"> — Weighted: congestion (50%) + speed factor (30%) + pedestrian density (20%)</w:t>
+      </w:r>
+    </w:p>
+    <w:p>
+      <w:pPr>
+        <w:pStyle w:val="ListBullet"/>
+        <w:spacing w:after="40"/>
+        <w:ind w:left="360"/>
+      </w:pPr>
+      <w:r/>
+      <w:r>
+        <w:rPr>
+          <w:b/>
+        </w:rPr>
+        <w:t>Weather</w:t>
+      </w:r>
+      <w:r>
+        <w:t xml:space="preserve"> — Controlled via </w:t>
+      </w:r>
+      <w:r>
+        <w:rPr>
+          <w:rFonts w:ascii="Courier New" w:hAnsi="Courier New"/>
+          <w:color w:val="C7254E"/>
+          <w:sz w:val="18"/>
+        </w:rPr>
+        <w:t>WEATHER_CONDITION</w:t>
+      </w:r>
+      <w:r>
+        <w:t xml:space="preserve"> env var on the Generator Lambda (</w:t>
+      </w:r>
+      <w:r>
+        <w:rPr>
+          <w:rFonts w:ascii="Courier New" w:hAnsi="Courier New"/>
+          <w:color w:val="C7254E"/>
+          <w:sz w:val="18"/>
+        </w:rPr>
+        <w:t>clear</w:t>
+      </w:r>
+      <w:r>
+        <w:t xml:space="preserve">, </w:t>
+      </w:r>
+      <w:r>
+        <w:rPr>
+          <w:rFonts w:ascii="Courier New" w:hAnsi="Courier New"/>
+          <w:color w:val="C7254E"/>
+          <w:sz w:val="18"/>
+        </w:rPr>
+        <w:t>rain</w:t>
+      </w:r>
+      <w:r>
+        <w:t xml:space="preserve">, </w:t>
+      </w:r>
+      <w:r>
+        <w:rPr>
+          <w:rFonts w:ascii="Courier New" w:hAnsi="Courier New"/>
+          <w:color w:val="C7254E"/>
+          <w:sz w:val="18"/>
+        </w:rPr>
+        <w:t>fog</w:t>
+      </w:r>
+      <w:r>
+        <w:t>)</w:t>
+      </w:r>
+    </w:p>
+    <w:p>
+      <w:pPr>
+        <w:pStyle w:val="Heading3"/>
+      </w:pPr>
+      <w:r>
+        <w:rPr>
+          <w:b/>
+          <w:color w:val="445566"/>
+          <w:sz w:val="24"/>
+        </w:rPr>
+        <w:t>DynamoDB Schema</w:t>
+      </w:r>
+    </w:p>
+    <w:tbl>
+      <w:tblPr>
+        <w:tblStyle w:val="TableGrid"/>
+        <w:tblW w:type="auto" w:w="0"/>
+        <w:tblLook w:firstColumn="1" w:firstRow="1" w:lastColumn="0" w:lastRow="0" w:noHBand="0" w:noVBand="1" w:val="04A0"/>
+      </w:tblPr>
+      <w:tblGrid>
+        <w:gridCol w:w="3041"/>
+        <w:gridCol w:w="3041"/>
+        <w:gridCol w:w="3041"/>
+      </w:tblGrid>
+      <w:tr>
+        <w:tc>
+          <w:tcPr>
+            <w:tcW w:type="dxa" w:w="3041"/>
+            <w:tcBorders>
+              <w:top w:val="single" w:sz="4" w:space="0" w:color="CCCCCC"/>
+              <w:left w:val="single" w:sz="4" w:space="0" w:color="CCCCCC"/>
+              <w:bottom w:val="single" w:sz="4" w:space="0" w:color="CCCCCC"/>
+              <w:right w:val="single" w:sz="4" w:space="0" w:color="CCCCCC"/>
+            </w:tcBorders>
+            <w:shd w:val="clear" w:color="auto" w:fill="1E3A5F"/>
+          </w:tcPr>
+          <w:p>
+            <w:pPr>
+              <w:spacing w:before="40" w:after="40"/>
+            </w:pPr>
+            <w:r>
+              <w:rPr>
+                <w:b/>
+                <w:color w:val="FFFFFF"/>
+                <w:sz w:val="18"/>
+              </w:rPr>
+              <w:t>Attribute</w:t>
+            </w:r>
+          </w:p>
+        </w:tc>
+        <w:tc>
+          <w:tcPr>
+            <w:tcW w:type="dxa" w:w="3041"/>
+            <w:tcBorders>
+              <w:top w:val="single" w:sz="4" w:space="0" w:color="CCCCCC"/>
+              <w:left w:val="single" w:sz="4" w:space="0" w:color="CCCCCC"/>
+              <w:bottom w:val="single" w:sz="4" w:space="0" w:color="CCCCCC"/>
+              <w:right w:val="single" w:sz="4" w:space="0" w:color="CCCCCC"/>
+            </w:tcBorders>
+            <w:shd w:val="clear" w:color="auto" w:fill="1E3A5F"/>
+          </w:tcPr>
+          <w:p>
+            <w:pPr>
+              <w:spacing w:before="40" w:after="40"/>
+            </w:pPr>
+            <w:r>
+              <w:rPr>
+                <w:b/>
+                <w:color w:val="FFFFFF"/>
+                <w:sz w:val="18"/>
+              </w:rPr>
+              <w:t>Type</w:t>
+            </w:r>
+          </w:p>
+        </w:tc>
+        <w:tc>
+          <w:tcPr>
+            <w:tcW w:type="dxa" w:w="3041"/>
+            <w:tcBorders>
+              <w:top w:val="single" w:sz="4" w:space="0" w:color="CCCCCC"/>
+              <w:left w:val="single" w:sz="4" w:space="0" w:color="CCCCCC"/>
+              <w:bottom w:val="single" w:sz="4" w:space="0" w:color="CCCCCC"/>
+              <w:right w:val="single" w:sz="4" w:space="0" w:color="CCCCCC"/>
+            </w:tcBorders>
+            <w:shd w:val="clear" w:color="auto" w:fill="1E3A5F"/>
+          </w:tcPr>
+          <w:p>
+            <w:pPr>
+              <w:spacing w:before="40" w:after="40"/>
+            </w:pPr>
+            <w:r>
+              <w:rPr>
+                <w:b/>
+                <w:color w:val="FFFFFF"/>
+                <w:sz w:val="18"/>
+              </w:rPr>
+              <w:t>Description</w:t>
+            </w:r>
+          </w:p>
+        </w:tc>
+      </w:tr>
+      <w:tr>
+        <w:tc>
+          <w:tcPr>
+            <w:tcW w:type="dxa" w:w="3041"/>
+            <w:tcBorders>
+              <w:top w:val="single" w:sz="4" w:space="0" w:color="CCCCCC"/>
+              <w:left w:val="single" w:sz="4" w:space="0" w:color="CCCCCC"/>
+              <w:bottom w:val="single" w:sz="4" w:space="0" w:color="CCCCCC"/>
+              <w:right w:val="single" w:sz="4" w:space="0" w:color="CCCCCC"/>
+            </w:tcBorders>
+          </w:tcPr>
+          <w:p>
+            <w:pPr>
+              <w:spacing w:before="40" w:after="40"/>
+            </w:pPr>
+            <w:r>
+              <w:rPr>
+                <w:sz w:val="18"/>
+              </w:rPr>
+              <w:t>city_id</w:t>
+            </w:r>
+          </w:p>
+        </w:tc>
+        <w:tc>
+          <w:tcPr>
+            <w:tcW w:type="dxa" w:w="3041"/>
+            <w:tcBorders>
+              <w:top w:val="single" w:sz="4" w:space="0" w:color="CCCCCC"/>
+              <w:left w:val="single" w:sz="4" w:space="0" w:color="CCCCCC"/>
+              <w:bottom w:val="single" w:sz="4" w:space="0" w:color="CCCCCC"/>
+              <w:right w:val="single" w:sz="4" w:space="0" w:color="CCCCCC"/>
+            </w:tcBorders>
+          </w:tcPr>
+          <w:p>
+            <w:pPr>
+              <w:spacing w:before="40" w:after="40"/>
+            </w:pPr>
+            <w:r>
+              <w:rPr>
+                <w:sz w:val="18"/>
+              </w:rPr>
+              <w:t>String (PK)</w:t>
+            </w:r>
+          </w:p>
+        </w:tc>
+        <w:tc>
+          <w:tcPr>
+            <w:tcW w:type="dxa" w:w="3041"/>
+            <w:tcBorders>
+              <w:top w:val="single" w:sz="4" w:space="0" w:color="CCCCCC"/>
+              <w:left w:val="single" w:sz="4" w:space="0" w:color="CCCCCC"/>
+              <w:bottom w:val="single" w:sz="4" w:space="0" w:color="CCCCCC"/>
+              <w:right w:val="single" w:sz="4" w:space="0" w:color="CCCCCC"/>
+            </w:tcBorders>
+          </w:tcPr>
+          <w:p>
+            <w:pPr>
+              <w:spacing w:before="40" w:after="40"/>
+            </w:pPr>
+            <w:r>
+              <w:rPr>
+                <w:sz w:val="18"/>
+              </w:rPr>
+              <w:t>springfield_il, khalifa_city_auh, mbz_city_auh</w:t>
+            </w:r>
+          </w:p>
+        </w:tc>
+      </w:tr>
+      <w:tr>
+        <w:tc>
+          <w:tcPr>
+            <w:tcW w:type="dxa" w:w="3041"/>
+            <w:tcBorders>
+              <w:top w:val="single" w:sz="4" w:space="0" w:color="CCCCCC"/>
+              <w:left w:val="single" w:sz="4" w:space="0" w:color="CCCCCC"/>
+              <w:bottom w:val="single" w:sz="4" w:space="0" w:color="CCCCCC"/>
+              <w:right w:val="single" w:sz="4" w:space="0" w:color="CCCCCC"/>
+            </w:tcBorders>
+            <w:shd w:val="clear" w:color="auto" w:fill="F0F4F8"/>
+          </w:tcPr>
+          <w:p>
+            <w:pPr>
+              <w:spacing w:before="40" w:after="40"/>
+            </w:pPr>
+            <w:r>
+              <w:rPr>
+                <w:sz w:val="18"/>
+              </w:rPr>
+              <w:t>zone_id</w:t>
+            </w:r>
+          </w:p>
+        </w:tc>
+        <w:tc>
+          <w:tcPr>
+            <w:tcW w:type="dxa" w:w="3041"/>
+            <w:tcBorders>
+              <w:top w:val="single" w:sz="4" w:space="0" w:color="CCCCCC"/>
+              <w:left w:val="single" w:sz="4" w:space="0" w:color="CCCCCC"/>
+              <w:bottom w:val="single" w:sz="4" w:space="0" w:color="CCCCCC"/>
+              <w:right w:val="single" w:sz="4" w:space="0" w:color="CCCCCC"/>
+            </w:tcBorders>
+            <w:shd w:val="clear" w:color="auto" w:fill="F0F4F8"/>
+          </w:tcPr>
+          <w:p>
+            <w:pPr>
+              <w:spacing w:before="40" w:after="40"/>
+            </w:pPr>
+            <w:r>
+              <w:rPr>
+                <w:sz w:val="18"/>
+              </w:rPr>
+              <w:t>String (SK)</w:t>
+            </w:r>
+          </w:p>
+        </w:tc>
+        <w:tc>
+          <w:tcPr>
+            <w:tcW w:type="dxa" w:w="3041"/>
+            <w:tcBorders>
+              <w:top w:val="single" w:sz="4" w:space="0" w:color="CCCCCC"/>
+              <w:left w:val="single" w:sz="4" w:space="0" w:color="CCCCCC"/>
+              <w:bottom w:val="single" w:sz="4" w:space="0" w:color="CCCCCC"/>
+              <w:right w:val="single" w:sz="4" w:space="0" w:color="CCCCCC"/>
+            </w:tcBorders>
+            <w:shd w:val="clear" w:color="auto" w:fill="F0F4F8"/>
+          </w:tcPr>
+          <w:p>
+            <w:pPr>
+              <w:spacing w:before="40" w:after="40"/>
+            </w:pPr>
+            <w:r>
+              <w:rPr>
+                <w:sz w:val="18"/>
+              </w:rPr>
+              <w:t>e.g. zone-001, khalifa-002</w:t>
+            </w:r>
+          </w:p>
+        </w:tc>
+      </w:tr>
+      <w:tr>
+        <w:tc>
+          <w:tcPr>
+            <w:tcW w:type="dxa" w:w="3041"/>
+            <w:tcBorders>
+              <w:top w:val="single" w:sz="4" w:space="0" w:color="CCCCCC"/>
+              <w:left w:val="single" w:sz="4" w:space="0" w:color="CCCCCC"/>
+              <w:bottom w:val="single" w:sz="4" w:space="0" w:color="CCCCCC"/>
+              <w:right w:val="single" w:sz="4" w:space="0" w:color="CCCCCC"/>
+            </w:tcBorders>
+          </w:tcPr>
+          <w:p>
+            <w:pPr>
+              <w:spacing w:before="40" w:after="40"/>
+            </w:pPr>
+            <w:r>
+              <w:rPr>
+                <w:sz w:val="18"/>
+              </w:rPr>
+              <w:t>zone_name</w:t>
+            </w:r>
+          </w:p>
+        </w:tc>
+        <w:tc>
+          <w:tcPr>
+            <w:tcW w:type="dxa" w:w="3041"/>
+            <w:tcBorders>
+              <w:top w:val="single" w:sz="4" w:space="0" w:color="CCCCCC"/>
+              <w:left w:val="single" w:sz="4" w:space="0" w:color="CCCCCC"/>
+              <w:bottom w:val="single" w:sz="4" w:space="0" w:color="CCCCCC"/>
+              <w:right w:val="single" w:sz="4" w:space="0" w:color="CCCCCC"/>
+            </w:tcBorders>
+          </w:tcPr>
+          <w:p>
+            <w:pPr>
+              <w:spacing w:before="40" w:after="40"/>
+            </w:pPr>
+            <w:r>
+              <w:rPr>
+                <w:sz w:val="18"/>
+              </w:rPr>
+              <w:t>String</w:t>
+            </w:r>
+          </w:p>
+        </w:tc>
+        <w:tc>
+          <w:tcPr>
+            <w:tcW w:type="dxa" w:w="3041"/>
+            <w:tcBorders>
+              <w:top w:val="single" w:sz="4" w:space="0" w:color="CCCCCC"/>
+              <w:left w:val="single" w:sz="4" w:space="0" w:color="CCCCCC"/>
+              <w:bottom w:val="single" w:sz="4" w:space="0" w:color="CCCCCC"/>
+              <w:right w:val="single" w:sz="4" w:space="0" w:color="CCCCCC"/>
+            </w:tcBorders>
+          </w:tcPr>
+          <w:p>
+            <w:pPr>
+              <w:spacing w:before="40" w:after="40"/>
+            </w:pPr>
+            <w:r>
+              <w:rPr>
+                <w:sz w:val="18"/>
+              </w:rPr>
+              <w:t>Human-readable name</w:t>
+            </w:r>
+          </w:p>
+        </w:tc>
+      </w:tr>
+      <w:tr>
+        <w:tc>
+          <w:tcPr>
+            <w:tcW w:type="dxa" w:w="3041"/>
+            <w:tcBorders>
+              <w:top w:val="single" w:sz="4" w:space="0" w:color="CCCCCC"/>
+              <w:left w:val="single" w:sz="4" w:space="0" w:color="CCCCCC"/>
+              <w:bottom w:val="single" w:sz="4" w:space="0" w:color="CCCCCC"/>
+              <w:right w:val="single" w:sz="4" w:space="0" w:color="CCCCCC"/>
+            </w:tcBorders>
+            <w:shd w:val="clear" w:color="auto" w:fill="F0F4F8"/>
+          </w:tcPr>
+          <w:p>
+            <w:pPr>
+              <w:spacing w:before="40" w:after="40"/>
+            </w:pPr>
+            <w:r>
+              <w:rPr>
+                <w:sz w:val="18"/>
+              </w:rPr>
+              <w:t>timestamp</w:t>
+            </w:r>
+          </w:p>
+        </w:tc>
+        <w:tc>
+          <w:tcPr>
+            <w:tcW w:type="dxa" w:w="3041"/>
+            <w:tcBorders>
+              <w:top w:val="single" w:sz="4" w:space="0" w:color="CCCCCC"/>
+              <w:left w:val="single" w:sz="4" w:space="0" w:color="CCCCCC"/>
+              <w:bottom w:val="single" w:sz="4" w:space="0" w:color="CCCCCC"/>
+              <w:right w:val="single" w:sz="4" w:space="0" w:color="CCCCCC"/>
+            </w:tcBorders>
+            <w:shd w:val="clear" w:color="auto" w:fill="F0F4F8"/>
+          </w:tcPr>
+          <w:p>
+            <w:pPr>
+              <w:spacing w:before="40" w:after="40"/>
+            </w:pPr>
+            <w:r>
+              <w:rPr>
+                <w:sz w:val="18"/>
+              </w:rPr>
+              <w:t>String</w:t>
+            </w:r>
+          </w:p>
+        </w:tc>
+        <w:tc>
+          <w:tcPr>
+            <w:tcW w:type="dxa" w:w="3041"/>
+            <w:tcBorders>
+              <w:top w:val="single" w:sz="4" w:space="0" w:color="CCCCCC"/>
+              <w:left w:val="single" w:sz="4" w:space="0" w:color="CCCCCC"/>
+              <w:bottom w:val="single" w:sz="4" w:space="0" w:color="CCCCCC"/>
+              <w:right w:val="single" w:sz="4" w:space="0" w:color="CCCCCC"/>
+            </w:tcBorders>
+            <w:shd w:val="clear" w:color="auto" w:fill="F0F4F8"/>
+          </w:tcPr>
+          <w:p>
+            <w:pPr>
+              <w:spacing w:before="40" w:after="40"/>
+            </w:pPr>
+            <w:r>
+              <w:rPr>
+                <w:sz w:val="18"/>
+              </w:rPr>
+              <w:t>ISO timestamp of the reading</w:t>
+            </w:r>
+          </w:p>
+        </w:tc>
+      </w:tr>
+      <w:tr>
+        <w:tc>
+          <w:tcPr>
+            <w:tcW w:type="dxa" w:w="3041"/>
+            <w:tcBorders>
+              <w:top w:val="single" w:sz="4" w:space="0" w:color="CCCCCC"/>
+              <w:left w:val="single" w:sz="4" w:space="0" w:color="CCCCCC"/>
+              <w:bottom w:val="single" w:sz="4" w:space="0" w:color="CCCCCC"/>
+              <w:right w:val="single" w:sz="4" w:space="0" w:color="CCCCCC"/>
+            </w:tcBorders>
+          </w:tcPr>
+          <w:p>
+            <w:pPr>
+              <w:spacing w:before="40" w:after="40"/>
+            </w:pPr>
+            <w:r>
+              <w:rPr>
+                <w:sz w:val="18"/>
+              </w:rPr>
+              <w:t>risk_score</w:t>
+            </w:r>
+          </w:p>
+        </w:tc>
+        <w:tc>
+          <w:tcPr>
+            <w:tcW w:type="dxa" w:w="3041"/>
+            <w:tcBorders>
+              <w:top w:val="single" w:sz="4" w:space="0" w:color="CCCCCC"/>
+              <w:left w:val="single" w:sz="4" w:space="0" w:color="CCCCCC"/>
+              <w:bottom w:val="single" w:sz="4" w:space="0" w:color="CCCCCC"/>
+              <w:right w:val="single" w:sz="4" w:space="0" w:color="CCCCCC"/>
+            </w:tcBorders>
+          </w:tcPr>
+          <w:p>
+            <w:pPr>
+              <w:spacing w:before="40" w:after="40"/>
+            </w:pPr>
+            <w:r>
+              <w:rPr>
+                <w:sz w:val="18"/>
+              </w:rPr>
+              <w:t>Number</w:t>
+            </w:r>
+          </w:p>
+        </w:tc>
+        <w:tc>
+          <w:tcPr>
+            <w:tcW w:type="dxa" w:w="3041"/>
+            <w:tcBorders>
+              <w:top w:val="single" w:sz="4" w:space="0" w:color="CCCCCC"/>
+              <w:left w:val="single" w:sz="4" w:space="0" w:color="CCCCCC"/>
+              <w:bottom w:val="single" w:sz="4" w:space="0" w:color="CCCCCC"/>
+              <w:right w:val="single" w:sz="4" w:space="0" w:color="CCCCCC"/>
+            </w:tcBorders>
+          </w:tcPr>
+          <w:p>
+            <w:pPr>
+              <w:spacing w:before="40" w:after="40"/>
+            </w:pPr>
+            <w:r>
+              <w:rPr>
+                <w:sz w:val="18"/>
+              </w:rPr>
+              <w:t>0–1</w:t>
+            </w:r>
+          </w:p>
+        </w:tc>
+      </w:tr>
+      <w:tr>
+        <w:tc>
+          <w:tcPr>
+            <w:tcW w:type="dxa" w:w="3041"/>
+            <w:tcBorders>
+              <w:top w:val="single" w:sz="4" w:space="0" w:color="CCCCCC"/>
+              <w:left w:val="single" w:sz="4" w:space="0" w:color="CCCCCC"/>
+              <w:bottom w:val="single" w:sz="4" w:space="0" w:color="CCCCCC"/>
+              <w:right w:val="single" w:sz="4" w:space="0" w:color="CCCCCC"/>
+            </w:tcBorders>
+            <w:shd w:val="clear" w:color="auto" w:fill="F0F4F8"/>
+          </w:tcPr>
+          <w:p>
+            <w:pPr>
+              <w:spacing w:before="40" w:after="40"/>
+            </w:pPr>
+            <w:r>
+              <w:rPr>
+                <w:sz w:val="18"/>
+              </w:rPr>
+              <w:t>vehicle_count</w:t>
+            </w:r>
+          </w:p>
+        </w:tc>
+        <w:tc>
+          <w:tcPr>
+            <w:tcW w:type="dxa" w:w="3041"/>
+            <w:tcBorders>
+              <w:top w:val="single" w:sz="4" w:space="0" w:color="CCCCCC"/>
+              <w:left w:val="single" w:sz="4" w:space="0" w:color="CCCCCC"/>
+              <w:bottom w:val="single" w:sz="4" w:space="0" w:color="CCCCCC"/>
+              <w:right w:val="single" w:sz="4" w:space="0" w:color="CCCCCC"/>
+            </w:tcBorders>
+            <w:shd w:val="clear" w:color="auto" w:fill="F0F4F8"/>
+          </w:tcPr>
+          <w:p>
+            <w:pPr>
+              <w:spacing w:before="40" w:after="40"/>
+            </w:pPr>
+            <w:r>
+              <w:rPr>
+                <w:sz w:val="18"/>
+              </w:rPr>
+              <w:t>Number</w:t>
+            </w:r>
+          </w:p>
+        </w:tc>
+        <w:tc>
+          <w:tcPr>
+            <w:tcW w:type="dxa" w:w="3041"/>
+            <w:tcBorders>
+              <w:top w:val="single" w:sz="4" w:space="0" w:color="CCCCCC"/>
+              <w:left w:val="single" w:sz="4" w:space="0" w:color="CCCCCC"/>
+              <w:bottom w:val="single" w:sz="4" w:space="0" w:color="CCCCCC"/>
+              <w:right w:val="single" w:sz="4" w:space="0" w:color="CCCCCC"/>
+            </w:tcBorders>
+            <w:shd w:val="clear" w:color="auto" w:fill="F0F4F8"/>
+          </w:tcPr>
+          <w:p>
+            <w:pPr>
+              <w:spacing w:before="40" w:after="40"/>
+            </w:pPr>
+            <w:r>
+              <w:rPr>
+                <w:sz w:val="18"/>
+              </w:rPr>
+              <w:t>Vehicles observed</w:t>
+            </w:r>
+          </w:p>
+        </w:tc>
+      </w:tr>
+      <w:tr>
+        <w:tc>
+          <w:tcPr>
+            <w:tcW w:type="dxa" w:w="3041"/>
+            <w:tcBorders>
+              <w:top w:val="single" w:sz="4" w:space="0" w:color="CCCCCC"/>
+              <w:left w:val="single" w:sz="4" w:space="0" w:color="CCCCCC"/>
+              <w:bottom w:val="single" w:sz="4" w:space="0" w:color="CCCCCC"/>
+              <w:right w:val="single" w:sz="4" w:space="0" w:color="CCCCCC"/>
+            </w:tcBorders>
+          </w:tcPr>
+          <w:p>
+            <w:pPr>
+              <w:spacing w:before="40" w:after="40"/>
+            </w:pPr>
+            <w:r>
+              <w:rPr>
+                <w:sz w:val="18"/>
+              </w:rPr>
+              <w:t>pedestrian_count</w:t>
+            </w:r>
+          </w:p>
+        </w:tc>
+        <w:tc>
+          <w:tcPr>
+            <w:tcW w:type="dxa" w:w="3041"/>
+            <w:tcBorders>
+              <w:top w:val="single" w:sz="4" w:space="0" w:color="CCCCCC"/>
+              <w:left w:val="single" w:sz="4" w:space="0" w:color="CCCCCC"/>
+              <w:bottom w:val="single" w:sz="4" w:space="0" w:color="CCCCCC"/>
+              <w:right w:val="single" w:sz="4" w:space="0" w:color="CCCCCC"/>
+            </w:tcBorders>
+          </w:tcPr>
+          <w:p>
+            <w:pPr>
+              <w:spacing w:before="40" w:after="40"/>
+            </w:pPr>
+            <w:r>
+              <w:rPr>
+                <w:sz w:val="18"/>
+              </w:rPr>
+              <w:t>Number</w:t>
+            </w:r>
+          </w:p>
+        </w:tc>
+        <w:tc>
+          <w:tcPr>
+            <w:tcW w:type="dxa" w:w="3041"/>
+            <w:tcBorders>
+              <w:top w:val="single" w:sz="4" w:space="0" w:color="CCCCCC"/>
+              <w:left w:val="single" w:sz="4" w:space="0" w:color="CCCCCC"/>
+              <w:bottom w:val="single" w:sz="4" w:space="0" w:color="CCCCCC"/>
+              <w:right w:val="single" w:sz="4" w:space="0" w:color="CCCCCC"/>
+            </w:tcBorders>
+          </w:tcPr>
+          <w:p>
+            <w:pPr>
+              <w:spacing w:before="40" w:after="40"/>
+            </w:pPr>
+            <w:r>
+              <w:rPr>
+                <w:sz w:val="18"/>
+              </w:rPr>
+              <w:t>Pedestrians observed</w:t>
+            </w:r>
+          </w:p>
+        </w:tc>
+      </w:tr>
+      <w:tr>
+        <w:tc>
+          <w:tcPr>
+            <w:tcW w:type="dxa" w:w="3041"/>
+            <w:tcBorders>
+              <w:top w:val="single" w:sz="4" w:space="0" w:color="CCCCCC"/>
+              <w:left w:val="single" w:sz="4" w:space="0" w:color="CCCCCC"/>
+              <w:bottom w:val="single" w:sz="4" w:space="0" w:color="CCCCCC"/>
+              <w:right w:val="single" w:sz="4" w:space="0" w:color="CCCCCC"/>
+            </w:tcBorders>
+            <w:shd w:val="clear" w:color="auto" w:fill="F0F4F8"/>
+          </w:tcPr>
+          <w:p>
+            <w:pPr>
+              <w:spacing w:before="40" w:after="40"/>
+            </w:pPr>
+            <w:r>
+              <w:rPr>
+                <w:sz w:val="18"/>
+              </w:rPr>
+              <w:t>speed_avg_mph</w:t>
+            </w:r>
+          </w:p>
+        </w:tc>
+        <w:tc>
+          <w:tcPr>
+            <w:tcW w:type="dxa" w:w="3041"/>
+            <w:tcBorders>
+              <w:top w:val="single" w:sz="4" w:space="0" w:color="CCCCCC"/>
+              <w:left w:val="single" w:sz="4" w:space="0" w:color="CCCCCC"/>
+              <w:bottom w:val="single" w:sz="4" w:space="0" w:color="CCCCCC"/>
+              <w:right w:val="single" w:sz="4" w:space="0" w:color="CCCCCC"/>
+            </w:tcBorders>
+            <w:shd w:val="clear" w:color="auto" w:fill="F0F4F8"/>
+          </w:tcPr>
+          <w:p>
+            <w:pPr>
+              <w:spacing w:before="40" w:after="40"/>
+            </w:pPr>
+            <w:r>
+              <w:rPr>
+                <w:sz w:val="18"/>
+              </w:rPr>
+              <w:t>Number</w:t>
+            </w:r>
+          </w:p>
+        </w:tc>
+        <w:tc>
+          <w:tcPr>
+            <w:tcW w:type="dxa" w:w="3041"/>
+            <w:tcBorders>
+              <w:top w:val="single" w:sz="4" w:space="0" w:color="CCCCCC"/>
+              <w:left w:val="single" w:sz="4" w:space="0" w:color="CCCCCC"/>
+              <w:bottom w:val="single" w:sz="4" w:space="0" w:color="CCCCCC"/>
+              <w:right w:val="single" w:sz="4" w:space="0" w:color="CCCCCC"/>
+            </w:tcBorders>
+            <w:shd w:val="clear" w:color="auto" w:fill="F0F4F8"/>
+          </w:tcPr>
+          <w:p>
+            <w:pPr>
+              <w:spacing w:before="40" w:after="40"/>
+            </w:pPr>
+            <w:r>
+              <w:rPr>
+                <w:sz w:val="18"/>
+              </w:rPr>
+              <w:t>Average speed</w:t>
+            </w:r>
+          </w:p>
+        </w:tc>
+      </w:tr>
+      <w:tr>
+        <w:tc>
+          <w:tcPr>
+            <w:tcW w:type="dxa" w:w="3041"/>
+            <w:tcBorders>
+              <w:top w:val="single" w:sz="4" w:space="0" w:color="CCCCCC"/>
+              <w:left w:val="single" w:sz="4" w:space="0" w:color="CCCCCC"/>
+              <w:bottom w:val="single" w:sz="4" w:space="0" w:color="CCCCCC"/>
+              <w:right w:val="single" w:sz="4" w:space="0" w:color="CCCCCC"/>
+            </w:tcBorders>
+          </w:tcPr>
+          <w:p>
+            <w:pPr>
+              <w:spacing w:before="40" w:after="40"/>
+            </w:pPr>
+            <w:r>
+              <w:rPr>
+                <w:sz w:val="18"/>
+              </w:rPr>
+              <w:t>congestion_index</w:t>
+            </w:r>
+          </w:p>
+        </w:tc>
+        <w:tc>
+          <w:tcPr>
+            <w:tcW w:type="dxa" w:w="3041"/>
+            <w:tcBorders>
+              <w:top w:val="single" w:sz="4" w:space="0" w:color="CCCCCC"/>
+              <w:left w:val="single" w:sz="4" w:space="0" w:color="CCCCCC"/>
+              <w:bottom w:val="single" w:sz="4" w:space="0" w:color="CCCCCC"/>
+              <w:right w:val="single" w:sz="4" w:space="0" w:color="CCCCCC"/>
+            </w:tcBorders>
+          </w:tcPr>
+          <w:p>
+            <w:pPr>
+              <w:spacing w:before="40" w:after="40"/>
+            </w:pPr>
+            <w:r>
+              <w:rPr>
+                <w:sz w:val="18"/>
+              </w:rPr>
+              <w:t>Number</w:t>
+            </w:r>
+          </w:p>
+        </w:tc>
+        <w:tc>
+          <w:tcPr>
+            <w:tcW w:type="dxa" w:w="3041"/>
+            <w:tcBorders>
+              <w:top w:val="single" w:sz="4" w:space="0" w:color="CCCCCC"/>
+              <w:left w:val="single" w:sz="4" w:space="0" w:color="CCCCCC"/>
+              <w:bottom w:val="single" w:sz="4" w:space="0" w:color="CCCCCC"/>
+              <w:right w:val="single" w:sz="4" w:space="0" w:color="CCCCCC"/>
+            </w:tcBorders>
+          </w:tcPr>
+          <w:p>
+            <w:pPr>
+              <w:spacing w:before="40" w:after="40"/>
+            </w:pPr>
+            <w:r>
+              <w:rPr>
+                <w:sz w:val="18"/>
+              </w:rPr>
+              <w:t>0–1</w:t>
+            </w:r>
+          </w:p>
+        </w:tc>
+      </w:tr>
+      <w:tr>
+        <w:tc>
+          <w:tcPr>
+            <w:tcW w:type="dxa" w:w="3041"/>
+            <w:tcBorders>
+              <w:top w:val="single" w:sz="4" w:space="0" w:color="CCCCCC"/>
+              <w:left w:val="single" w:sz="4" w:space="0" w:color="CCCCCC"/>
+              <w:bottom w:val="single" w:sz="4" w:space="0" w:color="CCCCCC"/>
+              <w:right w:val="single" w:sz="4" w:space="0" w:color="CCCCCC"/>
+            </w:tcBorders>
+            <w:shd w:val="clear" w:color="auto" w:fill="F0F4F8"/>
+          </w:tcPr>
+          <w:p>
+            <w:pPr>
+              <w:spacing w:before="40" w:after="40"/>
+            </w:pPr>
+            <w:r>
+              <w:rPr>
+                <w:sz w:val="18"/>
+              </w:rPr>
+              <w:t>active_cameras / total_cameras</w:t>
+            </w:r>
+          </w:p>
+        </w:tc>
+        <w:tc>
+          <w:tcPr>
+            <w:tcW w:type="dxa" w:w="3041"/>
+            <w:tcBorders>
+              <w:top w:val="single" w:sz="4" w:space="0" w:color="CCCCCC"/>
+              <w:left w:val="single" w:sz="4" w:space="0" w:color="CCCCCC"/>
+              <w:bottom w:val="single" w:sz="4" w:space="0" w:color="CCCCCC"/>
+              <w:right w:val="single" w:sz="4" w:space="0" w:color="CCCCCC"/>
+            </w:tcBorders>
+            <w:shd w:val="clear" w:color="auto" w:fill="F0F4F8"/>
+          </w:tcPr>
+          <w:p>
+            <w:pPr>
+              <w:spacing w:before="40" w:after="40"/>
+            </w:pPr>
+            <w:r>
+              <w:rPr>
+                <w:sz w:val="18"/>
+              </w:rPr>
+              <w:t>Number</w:t>
+            </w:r>
+          </w:p>
+        </w:tc>
+        <w:tc>
+          <w:tcPr>
+            <w:tcW w:type="dxa" w:w="3041"/>
+            <w:tcBorders>
+              <w:top w:val="single" w:sz="4" w:space="0" w:color="CCCCCC"/>
+              <w:left w:val="single" w:sz="4" w:space="0" w:color="CCCCCC"/>
+              <w:bottom w:val="single" w:sz="4" w:space="0" w:color="CCCCCC"/>
+              <w:right w:val="single" w:sz="4" w:space="0" w:color="CCCCCC"/>
+            </w:tcBorders>
+            <w:shd w:val="clear" w:color="auto" w:fill="F0F4F8"/>
+          </w:tcPr>
+          <w:p>
+            <w:pPr>
+              <w:spacing w:before="40" w:after="40"/>
+            </w:pPr>
+            <w:r>
+              <w:rPr>
+                <w:sz w:val="18"/>
+              </w:rPr>
+              <w:t>Camera counts</w:t>
+            </w:r>
+          </w:p>
+        </w:tc>
+      </w:tr>
+      <w:tr>
+        <w:tc>
+          <w:tcPr>
+            <w:tcW w:type="dxa" w:w="3041"/>
+            <w:tcBorders>
+              <w:top w:val="single" w:sz="4" w:space="0" w:color="CCCCCC"/>
+              <w:left w:val="single" w:sz="4" w:space="0" w:color="CCCCCC"/>
+              <w:bottom w:val="single" w:sz="4" w:space="0" w:color="CCCCCC"/>
+              <w:right w:val="single" w:sz="4" w:space="0" w:color="CCCCCC"/>
+            </w:tcBorders>
+          </w:tcPr>
+          <w:p>
+            <w:pPr>
+              <w:spacing w:before="40" w:after="40"/>
+            </w:pPr>
+            <w:r>
+              <w:rPr>
+                <w:sz w:val="18"/>
+              </w:rPr>
+              <w:t>weather</w:t>
+            </w:r>
+          </w:p>
+        </w:tc>
+        <w:tc>
+          <w:tcPr>
+            <w:tcW w:type="dxa" w:w="3041"/>
+            <w:tcBorders>
+              <w:top w:val="single" w:sz="4" w:space="0" w:color="CCCCCC"/>
+              <w:left w:val="single" w:sz="4" w:space="0" w:color="CCCCCC"/>
+              <w:bottom w:val="single" w:sz="4" w:space="0" w:color="CCCCCC"/>
+              <w:right w:val="single" w:sz="4" w:space="0" w:color="CCCCCC"/>
+            </w:tcBorders>
+          </w:tcPr>
+          <w:p>
+            <w:pPr>
+              <w:spacing w:before="40" w:after="40"/>
+            </w:pPr>
+            <w:r>
+              <w:rPr>
+                <w:sz w:val="18"/>
+              </w:rPr>
+              <w:t>String</w:t>
+            </w:r>
+          </w:p>
+        </w:tc>
+        <w:tc>
+          <w:tcPr>
+            <w:tcW w:type="dxa" w:w="3041"/>
+            <w:tcBorders>
+              <w:top w:val="single" w:sz="4" w:space="0" w:color="CCCCCC"/>
+              <w:left w:val="single" w:sz="4" w:space="0" w:color="CCCCCC"/>
+              <w:bottom w:val="single" w:sz="4" w:space="0" w:color="CCCCCC"/>
+              <w:right w:val="single" w:sz="4" w:space="0" w:color="CCCCCC"/>
+            </w:tcBorders>
+          </w:tcPr>
+          <w:p>
+            <w:pPr>
+              <w:spacing w:before="40" w:after="40"/>
+            </w:pPr>
+            <w:r>
+              <w:rPr>
+                <w:sz w:val="18"/>
+              </w:rPr>
+              <w:t>Active weather condition</w:t>
+            </w:r>
+          </w:p>
+        </w:tc>
+      </w:tr>
+      <w:tr>
+        <w:tc>
+          <w:tcPr>
+            <w:tcW w:type="dxa" w:w="3041"/>
+            <w:tcBorders>
+              <w:top w:val="single" w:sz="4" w:space="0" w:color="CCCCCC"/>
+              <w:left w:val="single" w:sz="4" w:space="0" w:color="CCCCCC"/>
+              <w:bottom w:val="single" w:sz="4" w:space="0" w:color="CCCCCC"/>
+              <w:right w:val="single" w:sz="4" w:space="0" w:color="CCCCCC"/>
+            </w:tcBorders>
+            <w:shd w:val="clear" w:color="auto" w:fill="F0F4F8"/>
+          </w:tcPr>
+          <w:p>
+            <w:pPr>
+              <w:spacing w:before="40" w:after="40"/>
+            </w:pPr>
+            <w:r>
+              <w:rPr>
+                <w:sz w:val="18"/>
+              </w:rPr>
+              <w:t>ttl</w:t>
+            </w:r>
+          </w:p>
+        </w:tc>
+        <w:tc>
+          <w:tcPr>
+            <w:tcW w:type="dxa" w:w="3041"/>
+            <w:tcBorders>
+              <w:top w:val="single" w:sz="4" w:space="0" w:color="CCCCCC"/>
+              <w:left w:val="single" w:sz="4" w:space="0" w:color="CCCCCC"/>
+              <w:bottom w:val="single" w:sz="4" w:space="0" w:color="CCCCCC"/>
+              <w:right w:val="single" w:sz="4" w:space="0" w:color="CCCCCC"/>
+            </w:tcBorders>
+            <w:shd w:val="clear" w:color="auto" w:fill="F0F4F8"/>
+          </w:tcPr>
+          <w:p>
+            <w:pPr>
+              <w:spacing w:before="40" w:after="40"/>
+            </w:pPr>
+            <w:r>
+              <w:rPr>
+                <w:sz w:val="18"/>
+              </w:rPr>
+              <w:t>Number</w:t>
+            </w:r>
+          </w:p>
+        </w:tc>
+        <w:tc>
+          <w:tcPr>
+            <w:tcW w:type="dxa" w:w="3041"/>
+            <w:tcBorders>
+              <w:top w:val="single" w:sz="4" w:space="0" w:color="CCCCCC"/>
+              <w:left w:val="single" w:sz="4" w:space="0" w:color="CCCCCC"/>
+              <w:bottom w:val="single" w:sz="4" w:space="0" w:color="CCCCCC"/>
+              <w:right w:val="single" w:sz="4" w:space="0" w:color="CCCCCC"/>
+            </w:tcBorders>
+            <w:shd w:val="clear" w:color="auto" w:fill="F0F4F8"/>
+          </w:tcPr>
+          <w:p>
+            <w:pPr>
+              <w:spacing w:before="40" w:after="40"/>
+            </w:pPr>
+            <w:r>
+              <w:rPr>
+                <w:sz w:val="18"/>
+              </w:rPr>
+              <w:t>Unix epoch; DynamoDB auto-deletes after 10 minutes</w:t>
+            </w:r>
+          </w:p>
+        </w:tc>
+      </w:tr>
+    </w:tbl>
+    <w:p/>
+    <w:p>
+      <w:pPr>
+        <w:pStyle w:val="Heading3"/>
+      </w:pPr>
+      <w:r>
+        <w:rPr>
+          <w:b/>
+          <w:color w:val="445566"/>
+          <w:sz w:val="24"/>
+        </w:rPr>
+        <w:t>Snapshot API</w:t>
+      </w:r>
+    </w:p>
+    <w:p>
+      <w:pPr>
+        <w:pStyle w:val="ListBullet"/>
+        <w:spacing w:after="40"/>
+        <w:ind w:left="360"/>
+      </w:pPr>
+      <w:r/>
+      <w:r>
+        <w:rPr>
+          <w:b/>
+        </w:rPr>
+        <w:t>Endpoint:</w:t>
+      </w:r>
+      <w:r>
+        <w:t xml:space="preserve"> Lambda Function URL (HTTPS, no auth, CORS open)</w:t>
+      </w:r>
+    </w:p>
+    <w:p>
+      <w:pPr>
+        <w:pStyle w:val="ListBullet"/>
+        <w:spacing w:after="40"/>
+        <w:ind w:left="360"/>
+      </w:pPr>
+      <w:r/>
+      <w:r>
+        <w:rPr>
+          <w:b/>
+        </w:rPr>
+        <w:t>Method:</w:t>
+      </w:r>
+      <w:r>
+        <w:t xml:space="preserve"> </w:t>
+      </w:r>
+      <w:r>
+        <w:rPr>
+          <w:rFonts w:ascii="Courier New" w:hAnsi="Courier New"/>
+          <w:color w:val="C7254E"/>
+          <w:sz w:val="18"/>
+        </w:rPr>
+        <w:t>GET</w:t>
+      </w:r>
+      <w:r/>
+    </w:p>
+    <w:p>
+      <w:pPr>
+        <w:pStyle w:val="ListBullet"/>
+        <w:spacing w:after="40"/>
+        <w:ind w:left="360"/>
+      </w:pPr>
+      <w:r/>
+      <w:r>
+        <w:rPr>
+          <w:b/>
+        </w:rPr>
+        <w:t>Query params:</w:t>
+      </w:r>
+      <w:r>
+        <w:t xml:space="preserve"> </w:t>
+      </w:r>
+      <w:r>
+        <w:rPr>
+          <w:rFonts w:ascii="Courier New" w:hAnsi="Courier New"/>
+          <w:color w:val="C7254E"/>
+          <w:sz w:val="18"/>
+        </w:rPr>
+        <w:t>?city=&lt;cityId&gt;</w:t>
+      </w:r>
+      <w:r>
+        <w:t xml:space="preserve"> and </w:t>
+      </w:r>
+      <w:r>
+        <w:rPr>
+          <w:rFonts w:ascii="Courier New" w:hAnsi="Courier New"/>
+          <w:color w:val="C7254E"/>
+          <w:sz w:val="18"/>
+        </w:rPr>
+        <w:t>?weather=&lt;condition&gt;</w:t>
+      </w:r>
+      <w:r/>
+    </w:p>
+    <w:p>
+      <w:pPr>
+        <w:pStyle w:val="ListBullet"/>
+        <w:spacing w:after="40"/>
+        <w:ind w:left="360"/>
+      </w:pPr>
+      <w:r/>
+      <w:r>
+        <w:rPr>
+          <w:b/>
+        </w:rPr>
+        <w:t>Response:</w:t>
+      </w:r>
+      <w:r>
+        <w:t xml:space="preserve"> </w:t>
+      </w:r>
+      <w:r>
+        <w:rPr>
+          <w:rFonts w:ascii="Courier New" w:hAnsi="Courier New"/>
+          <w:color w:val="C7254E"/>
+          <w:sz w:val="18"/>
+        </w:rPr>
+        <w:t>LiveState</w:t>
+      </w:r>
+      <w:r>
+        <w:t xml:space="preserve"> JSON — identical shape to the static mock files</w:t>
+      </w:r>
+    </w:p>
+    <w:p>
+      <w:pPr>
+        <w:pStyle w:val="ListBullet"/>
+        <w:spacing w:after="40"/>
+        <w:ind w:left="360"/>
+      </w:pPr>
+      <w:r/>
+      <w:r>
+        <w:rPr>
+          <w:b/>
+        </w:rPr>
+        <w:t>Fallback:</w:t>
+      </w:r>
+      <w:r>
+        <w:t xml:space="preserve"> If DynamoDB has no records (e.g. before the first generator run), the Lambda computes the response directly from the traffic model</w:t>
+      </w:r>
+    </w:p>
+    <w:p>
+      <w:pPr>
+        <w:pStyle w:val="Heading3"/>
+      </w:pPr>
+      <w:r>
+        <w:rPr>
+          <w:b/>
+          <w:color w:val="445566"/>
+          <w:sz w:val="24"/>
+        </w:rPr>
+        <w:t>S3 Data Lake Layout</w:t>
+      </w:r>
+    </w:p>
+    <w:p>
+      <w:pPr>
+        <w:spacing w:before="80" w:after="80"/>
+        <w:ind w:left="576"/>
+        <w:shd w:val="clear" w:color="auto" w:fill="F3F4F6"/>
+      </w:pPr>
+      <w:r>
+        <w:rPr>
+          <w:rFonts w:ascii="Courier New" w:hAnsi="Courier New"/>
+          <w:color w:val="2D2D2D"/>
+          <w:sz w:val="16"/>
+        </w:rPr>
+        <w:t>s3://schoolzone-datalake-&lt;account&gt;-&lt;region&gt;/</w:t>
+        <w:br/>
+        <w:t>└── raw/</w:t>
+        <w:br/>
+        <w:t xml:space="preserve">    └── year=2026/month=03/day=01/hour=14/</w:t>
+        <w:br/>
+        <w:t xml:space="preserve">        └── schoolzone-to-datalake-1-2026-03-01-14-00-00-&lt;uuid&gt;.gz</w:t>
+      </w:r>
+    </w:p>
+    <w:p>
+      <w:pPr>
+        <w:spacing w:after="80"/>
+      </w:pPr>
+      <w:r>
+        <w:rPr>
+          <w:color w:val="1A1A2E"/>
+          <w:sz w:val="20"/>
+        </w:rPr>
+        <w:t>Records are newline-delimited JSON (NDJSON), queryable via AWS Glue + Athena.</w:t>
+      </w:r>
+    </w:p>
+    <w:p>
+      <w:pPr>
+        <w:pStyle w:val="Heading3"/>
+      </w:pPr>
+      <w:r>
+        <w:rPr>
+          <w:b/>
+          <w:color w:val="445566"/>
+          <w:sz w:val="24"/>
+        </w:rPr>
+        <w:t>App Integration</w:t>
+      </w:r>
+    </w:p>
+    <w:p>
+      <w:pPr>
+        <w:spacing w:after="80"/>
+      </w:pPr>
+      <w:r>
+        <w:rPr>
+          <w:color w:val="1A1A2E"/>
+          <w:sz w:val="20"/>
+        </w:rPr>
+      </w:r>
+      <w:r>
+        <w:rPr>
+          <w:rFonts w:ascii="Courier New" w:hAnsi="Courier New"/>
+          <w:color w:val="1A1A2E"/>
+          <w:sz w:val="20"/>
+        </w:rPr>
+        <w:t>lib/data.ts</w:t>
+      </w:r>
+      <w:r>
+        <w:rPr>
+          <w:color w:val="1A1A2E"/>
+          <w:sz w:val="20"/>
+        </w:rPr>
+        <w:t xml:space="preserve"> — </w:t>
+      </w:r>
+      <w:r>
+        <w:rPr>
+          <w:rFonts w:ascii="Courier New" w:hAnsi="Courier New"/>
+          <w:color w:val="1A1A2E"/>
+          <w:sz w:val="20"/>
+        </w:rPr>
+        <w:t>loadLiveState()</w:t>
+      </w:r>
+      <w:r>
+        <w:rPr>
+          <w:color w:val="1A1A2E"/>
+          <w:sz w:val="20"/>
+        </w:rPr>
+        <w:t xml:space="preserve"> checks </w:t>
+      </w:r>
+      <w:r>
+        <w:rPr>
+          <w:rFonts w:ascii="Courier New" w:hAnsi="Courier New"/>
+          <w:color w:val="1A1A2E"/>
+          <w:sz w:val="20"/>
+        </w:rPr>
+        <w:t>NEXT_PUBLIC_AWS_SNAPSHOT_API_URL</w:t>
+      </w:r>
+      <w:r>
+        <w:rPr>
+          <w:color w:val="1A1A2E"/>
+          <w:sz w:val="20"/>
+        </w:rPr>
+        <w:t>:</w:t>
+      </w:r>
+    </w:p>
+    <w:p>
+      <w:pPr>
+        <w:pStyle w:val="ListNumber"/>
+        <w:spacing w:after="40"/>
+      </w:pPr>
+      <w:r>
+        <w:t xml:space="preserve">If set → </w:t>
+      </w:r>
+      <w:r>
+        <w:rPr>
+          <w:rFonts w:ascii="Courier New" w:hAnsi="Courier New"/>
+          <w:color w:val="C7254E"/>
+          <w:sz w:val="18"/>
+        </w:rPr>
+        <w:t>GET &lt;url&gt;?city=&lt;cityId&gt;&amp;weather=&lt;condition&gt;</w:t>
+      </w:r>
+      <w:r/>
+    </w:p>
+    <w:p>
+      <w:pPr>
+        <w:pStyle w:val="ListNumber"/>
+        <w:spacing w:after="40"/>
+      </w:pPr>
+      <w:r>
+        <w:t>On failure → falls back to static mock JSON (silent, logs a warning)</w:t>
+      </w:r>
+    </w:p>
+    <w:p>
+      <w:pPr>
+        <w:pStyle w:val="ListNumber"/>
+        <w:spacing w:after="40"/>
+      </w:pPr>
+      <w:r>
+        <w:t>If not set → static mock JSON directly</w:t>
+      </w:r>
+    </w:p>
+    <w:p>
+      <w:pPr>
+        <w:spacing w:after="80"/>
+      </w:pPr>
+      <w:r>
+        <w:rPr>
+          <w:color w:val="1A1A2E"/>
+          <w:sz w:val="20"/>
+        </w:rPr>
+        <w:t>No other changes to the application are required.</w:t>
+      </w:r>
+    </w:p>
+    <w:p>
+      <w:pPr>
+        <w:pStyle w:val="Heading3"/>
+      </w:pPr>
+      <w:r>
+        <w:rPr>
+          <w:b/>
+          <w:color w:val="445566"/>
+          <w:sz w:val="24"/>
+        </w:rPr>
+        <w:t>CDK Deployment</w:t>
+      </w:r>
+    </w:p>
+    <w:p>
+      <w:pPr>
+        <w:spacing w:before="80" w:after="80"/>
+        <w:ind w:left="576"/>
+        <w:shd w:val="clear" w:color="auto" w:fill="F3F4F6"/>
+      </w:pPr>
+      <w:r>
+        <w:rPr>
+          <w:rFonts w:ascii="Courier New" w:hAnsi="Courier New"/>
+          <w:color w:val="2D2D2D"/>
+          <w:sz w:val="16"/>
+        </w:rPr>
+        <w:t>cd infra</w:t>
+        <w:br/>
+        <w:t>npm install</w:t>
+        <w:br/>
+        <w:t>cdk bootstrap   # once per AWS account/region</w:t>
+        <w:br/>
+        <w:t>cdk deploy      # ~2 minutes</w:t>
+      </w:r>
+    </w:p>
+    <w:p>
+      <w:pPr>
+        <w:spacing w:after="80"/>
+      </w:pPr>
+      <w:r>
+        <w:rPr>
+          <w:color w:val="1A1A2E"/>
+          <w:sz w:val="20"/>
+        </w:rPr>
+      </w:r>
+      <w:r>
+        <w:rPr>
+          <w:rFonts w:ascii="Courier New" w:hAnsi="Courier New"/>
+          <w:color w:val="1A1A2E"/>
+          <w:sz w:val="20"/>
+        </w:rPr>
+        <w:t>cdk deploy</w:t>
+      </w:r>
+      <w:r>
+        <w:rPr>
+          <w:color w:val="1A1A2E"/>
+          <w:sz w:val="20"/>
+        </w:rPr>
+        <w:t xml:space="preserve"> outputs the </w:t>
+      </w:r>
+      <w:r>
+        <w:rPr>
+          <w:rFonts w:ascii="Courier New" w:hAnsi="Courier New"/>
+          <w:color w:val="1A1A2E"/>
+          <w:sz w:val="20"/>
+        </w:rPr>
+        <w:t>SnapshotApiUrl</w:t>
+      </w:r>
+      <w:r>
+        <w:rPr>
+          <w:color w:val="1A1A2E"/>
+          <w:sz w:val="20"/>
+        </w:rPr>
+        <w:t xml:space="preserve"> to copy into </w:t>
+      </w:r>
+      <w:r>
+        <w:rPr>
+          <w:rFonts w:ascii="Courier New" w:hAnsi="Courier New"/>
+          <w:color w:val="1A1A2E"/>
+          <w:sz w:val="20"/>
+        </w:rPr>
+        <w:t>.env.local</w:t>
+      </w:r>
+      <w:r>
+        <w:rPr>
+          <w:color w:val="1A1A2E"/>
+          <w:sz w:val="20"/>
+        </w:rPr>
+        <w:t>.</w:t>
+      </w:r>
+    </w:p>
+    <w:p>
+      <w:pPr>
+        <w:pBdr>
+          <w:bottom w:val="single" w:sz="6" w:space="1" w:color="CCCCCC"/>
+        </w:pBdr>
+      </w:pPr>
+    </w:p>
+    <w:p>
+      <w:pPr>
+        <w:pStyle w:val="Heading2"/>
+      </w:pPr>
+      <w:r>
+        <w:rPr>
+          <w:b/>
+          <w:color w:val="0D7C8F"/>
+          <w:sz w:val="28"/>
+        </w:rPr>
+        <w:t>9. External Integrations</w:t>
       </w:r>
     </w:p>
     <w:p>
@@ -17517,9 +20088,41 @@
         <w:br/>
         <w:t>│           └── integration.json</w:t>
         <w:br/>
+        <w:t>├── infra/                              # AWS CDK data pipeline</w:t>
+        <w:br/>
+        <w:t>│   ├── bin/app.ts                      # CDK app entry point</w:t>
+        <w:br/>
+        <w:t>│   ├── lib/schoolzone-stack.ts         # Stack: Kinesis, S3, DynamoDB, Lambdas</w:t>
+        <w:br/>
+        <w:t>│   ├── lambdas/</w:t>
+        <w:br/>
+        <w:t>│   │   ├── generator/</w:t>
+        <w:br/>
+        <w:t>│   │   │   ├── index.ts               # Lambda handler — publishes to Kinesis</w:t>
+        <w:br/>
+        <w:t>│   │   │   ├── model.ts               # Gaussian traffic model + forecast</w:t>
+        <w:br/>
+        <w:t>│   │   │   └── zones.ts               # Zone definitions (all 3 cities, 11 zones)</w:t>
+        <w:br/>
+        <w:t>│   │   ├── processor/</w:t>
+        <w:br/>
+        <w:t>│   │   │   └── index.ts               # Kinesis → DynamoDB writer</w:t>
+        <w:br/>
+        <w:t>│   │   └── snapshot-api/</w:t>
+        <w:br/>
+        <w:t>│   │       └── index.ts               # DynamoDB → LiveState JSON API</w:t>
+        <w:br/>
+        <w:t>│   ├── package.json</w:t>
+        <w:br/>
+        <w:t>│   ├── tsconfig.json</w:t>
+        <w:br/>
+        <w:t>│   ├── cdk.json</w:t>
+        <w:br/>
+        <w:t>│   └── README.md                       # Infrastructure setup guide</w:t>
+        <w:br/>
         <w:t>└── docs/</w:t>
         <w:br/>
-        <w:t xml:space="preserve">    └── SPECIFICATION.md                 # This document</w:t>
+        <w:t xml:space="preserve">    └── SPECIFICATION.md                # This document</w:t>
       </w:r>
     </w:p>
     <w:p>
@@ -18123,6 +20726,100 @@
                 <w:sz w:val="18"/>
               </w:rPr>
               <w:t>Supabase anonymous API key</w:t>
+            </w:r>
+          </w:p>
+        </w:tc>
+      </w:tr>
+      <w:tr>
+        <w:tc>
+          <w:tcPr>
+            <w:tcW w:type="dxa" w:w="2280"/>
+            <w:tcBorders>
+              <w:top w:val="single" w:sz="4" w:space="0" w:color="CCCCCC"/>
+              <w:left w:val="single" w:sz="4" w:space="0" w:color="CCCCCC"/>
+              <w:bottom w:val="single" w:sz="4" w:space="0" w:color="CCCCCC"/>
+              <w:right w:val="single" w:sz="4" w:space="0" w:color="CCCCCC"/>
+            </w:tcBorders>
+            <w:shd w:val="clear" w:color="auto" w:fill="F0F4F8"/>
+          </w:tcPr>
+          <w:p>
+            <w:pPr>
+              <w:spacing w:before="40" w:after="40"/>
+            </w:pPr>
+            <w:r>
+              <w:rPr>
+                <w:sz w:val="18"/>
+              </w:rPr>
+              <w:t>NEXT_PUBLIC_AWS_SNAPSHOT_API_URL</w:t>
+            </w:r>
+          </w:p>
+        </w:tc>
+        <w:tc>
+          <w:tcPr>
+            <w:tcW w:type="dxa" w:w="2280"/>
+            <w:tcBorders>
+              <w:top w:val="single" w:sz="4" w:space="0" w:color="CCCCCC"/>
+              <w:left w:val="single" w:sz="4" w:space="0" w:color="CCCCCC"/>
+              <w:bottom w:val="single" w:sz="4" w:space="0" w:color="CCCCCC"/>
+              <w:right w:val="single" w:sz="4" w:space="0" w:color="CCCCCC"/>
+            </w:tcBorders>
+            <w:shd w:val="clear" w:color="auto" w:fill="F0F4F8"/>
+          </w:tcPr>
+          <w:p>
+            <w:pPr>
+              <w:spacing w:before="40" w:after="40"/>
+            </w:pPr>
+            <w:r>
+              <w:rPr>
+                <w:sz w:val="18"/>
+              </w:rPr>
+              <w:t>No</w:t>
+            </w:r>
+          </w:p>
+        </w:tc>
+        <w:tc>
+          <w:tcPr>
+            <w:tcW w:type="dxa" w:w="2280"/>
+            <w:tcBorders>
+              <w:top w:val="single" w:sz="4" w:space="0" w:color="CCCCCC"/>
+              <w:left w:val="single" w:sz="4" w:space="0" w:color="CCCCCC"/>
+              <w:bottom w:val="single" w:sz="4" w:space="0" w:color="CCCCCC"/>
+              <w:right w:val="single" w:sz="4" w:space="0" w:color="CCCCCC"/>
+            </w:tcBorders>
+            <w:shd w:val="clear" w:color="auto" w:fill="F0F4F8"/>
+          </w:tcPr>
+          <w:p>
+            <w:pPr>
+              <w:spacing w:before="40" w:after="40"/>
+            </w:pPr>
+            <w:r>
+              <w:rPr>
+                <w:sz w:val="18"/>
+              </w:rPr>
+              <w:t>Client</w:t>
+            </w:r>
+          </w:p>
+        </w:tc>
+        <w:tc>
+          <w:tcPr>
+            <w:tcW w:type="dxa" w:w="2280"/>
+            <w:tcBorders>
+              <w:top w:val="single" w:sz="4" w:space="0" w:color="CCCCCC"/>
+              <w:left w:val="single" w:sz="4" w:space="0" w:color="CCCCCC"/>
+              <w:bottom w:val="single" w:sz="4" w:space="0" w:color="CCCCCC"/>
+              <w:right w:val="single" w:sz="4" w:space="0" w:color="CCCCCC"/>
+            </w:tcBorders>
+            <w:shd w:val="clear" w:color="auto" w:fill="F0F4F8"/>
+          </w:tcPr>
+          <w:p>
+            <w:pPr>
+              <w:spacing w:before="40" w:after="40"/>
+            </w:pPr>
+            <w:r>
+              <w:rPr>
+                <w:sz w:val="18"/>
+              </w:rPr>
+              <w:t>Lambda Function URL for live data pipeline. If set, app fetches live telemetry instead of mock JSON.</w:t>
             </w:r>
           </w:p>
         </w:tc>
@@ -18484,7 +21181,7 @@
               <w:rPr>
                 <w:sz w:val="18"/>
               </w:rPr>
-              <w:t>Data</w:t>
+              <w:t>Timestream</w:t>
             </w:r>
           </w:p>
         </w:tc>
@@ -18507,7 +21204,7 @@
               <w:rPr>
                 <w:sz w:val="18"/>
               </w:rPr>
-              <w:t>All telemetry is static mock data. No live sensor integration in current build.</w:t>
+              <w:t>Amazon Timestream for LiveAnalytics requires special account enablement for new AWS accounts. DynamoDB is used instead as the hot store. Timestream can be re-introduced once enabled.</w:t>
             </w:r>
           </w:p>
         </w:tc>
@@ -18531,7 +21228,7 @@
               <w:rPr>
                 <w:sz w:val="18"/>
               </w:rPr>
-              <w:t>Supabase access control</w:t>
+              <w:t>Data</w:t>
             </w:r>
           </w:p>
         </w:tc>
@@ -18553,7 +21250,7 @@
               <w:rPr>
                 <w:sz w:val="18"/>
               </w:rPr>
-              <w:t>Public anonymous access with no RLS enforcement. All users can read and insert interventions.</w:t>
+              <w:t>All telemetry is static mock data. No live sensor integration in current build.</w:t>
             </w:r>
           </w:p>
         </w:tc>
@@ -18578,7 +21275,7 @@
               <w:rPr>
                 <w:sz w:val="18"/>
               </w:rPr>
-              <w:t>AI brief latency</w:t>
+              <w:t>Supabase access control</w:t>
             </w:r>
           </w:p>
         </w:tc>
@@ -18601,7 +21298,7 @@
               <w:rPr>
                 <w:sz w:val="18"/>
               </w:rPr>
-              <w:t>Dependent on OpenAI API response time (typically 3–8 s). No streaming implemented.</w:t>
+              <w:t>Public anonymous access with no RLS enforcement. All users can read and insert interventions.</w:t>
             </w:r>
           </w:p>
         </w:tc>
@@ -18625,7 +21322,7 @@
               <w:rPr>
                 <w:sz w:val="18"/>
               </w:rPr>
-              <w:t>Session sharing</w:t>
+              <w:t>AI brief latency</w:t>
             </w:r>
           </w:p>
         </w:tc>
@@ -18647,7 +21344,7 @@
               <w:rPr>
                 <w:sz w:val="18"/>
               </w:rPr>
-              <w:t>Supabase Realtime syncs interventions across sessions, but snapshot state is client-local; users may see different base states.</w:t>
+              <w:t>Dependent on OpenAI API response time (typically 3–8 s). No streaming implemented.</w:t>
             </w:r>
           </w:p>
         </w:tc>
@@ -18672,7 +21369,7 @@
               <w:rPr>
                 <w:sz w:val="18"/>
               </w:rPr>
-              <w:t>Map bounds</w:t>
+              <w:t>Session sharing</w:t>
             </w:r>
           </w:p>
         </w:tc>
@@ -18695,7 +21392,7 @@
               <w:rPr>
                 <w:sz w:val="18"/>
               </w:rPr>
-              <w:t>Each city enforces a restriction.latLngBounds to prevent panning away. Min zoom is 12.</w:t>
+              <w:t>Supabase Realtime syncs interventions across sessions, but snapshot state is client-local; users may see different base states.</w:t>
             </w:r>
           </w:p>
         </w:tc>
@@ -18719,7 +21416,7 @@
               <w:rPr>
                 <w:sz w:val="18"/>
               </w:rPr>
-              <w:t>Incident coordinates</w:t>
+              <w:t>Map bounds</w:t>
             </w:r>
           </w:p>
         </w:tc>
@@ -18741,7 +21438,7 @@
               <w:rPr>
                 <w:sz w:val="18"/>
               </w:rPr>
-              <w:t>Incidents are offset randomly from school coordinates. Positions change on every render if mapIncidentsToCoords() is called without memoization.</w:t>
+              <w:t>Each city enforces a restriction.latLngBounds to prevent panning away. Min zoom is 12.</w:t>
             </w:r>
           </w:p>
         </w:tc>
@@ -18766,7 +21463,7 @@
               <w:rPr>
                 <w:sz w:val="18"/>
               </w:rPr>
-              <w:t>Parent flow model</w:t>
+              <w:t>Incident coordinates</w:t>
             </w:r>
           </w:p>
         </w:tc>
@@ -18789,7 +21486,7 @@
               <w:rPr>
                 <w:sz w:val="18"/>
               </w:rPr>
-              <w:t>Simplified Gaussian model; not calibrated to real school data.</w:t>
+              <w:t>Incidents are offset randomly from school coordinates. Positions change on every render if mapIncidentsToCoords() is called without memoization.</w:t>
             </w:r>
           </w:p>
         </w:tc>
@@ -18813,7 +21510,7 @@
               <w:rPr>
                 <w:sz w:val="18"/>
               </w:rPr>
-              <w:t>No mobile layout</w:t>
+              <w:t>Parent flow model</w:t>
             </w:r>
           </w:p>
         </w:tc>
@@ -18835,7 +21532,7 @@
               <w:rPr>
                 <w:sz w:val="18"/>
               </w:rPr>
-              <w:t>UI is optimized for desktop (1280px+). Sidebar collapses on mobile but map and panels are not fully responsive.</w:t>
+              <w:t>Simplified Gaussian model; not calibrated to real school data.</w:t>
             </w:r>
           </w:p>
         </w:tc>
@@ -18860,6 +21557,53 @@
               <w:rPr>
                 <w:sz w:val="18"/>
               </w:rPr>
+              <w:t>No mobile layout</w:t>
+            </w:r>
+          </w:p>
+        </w:tc>
+        <w:tc>
+          <w:tcPr>
+            <w:tcW w:type="dxa" w:w="4561"/>
+            <w:tcBorders>
+              <w:top w:val="single" w:sz="4" w:space="0" w:color="CCCCCC"/>
+              <w:left w:val="single" w:sz="4" w:space="0" w:color="CCCCCC"/>
+              <w:bottom w:val="single" w:sz="4" w:space="0" w:color="CCCCCC"/>
+              <w:right w:val="single" w:sz="4" w:space="0" w:color="CCCCCC"/>
+            </w:tcBorders>
+            <w:shd w:val="clear" w:color="auto" w:fill="F0F4F8"/>
+          </w:tcPr>
+          <w:p>
+            <w:pPr>
+              <w:spacing w:before="40" w:after="40"/>
+            </w:pPr>
+            <w:r>
+              <w:rPr>
+                <w:sz w:val="18"/>
+              </w:rPr>
+              <w:t>UI is optimized for desktop (1280px+). Sidebar collapses on mobile but map and panels are not fully responsive.</w:t>
+            </w:r>
+          </w:p>
+        </w:tc>
+      </w:tr>
+      <w:tr>
+        <w:tc>
+          <w:tcPr>
+            <w:tcW w:type="dxa" w:w="4561"/>
+            <w:tcBorders>
+              <w:top w:val="single" w:sz="4" w:space="0" w:color="CCCCCC"/>
+              <w:left w:val="single" w:sz="4" w:space="0" w:color="CCCCCC"/>
+              <w:bottom w:val="single" w:sz="4" w:space="0" w:color="CCCCCC"/>
+              <w:right w:val="single" w:sz="4" w:space="0" w:color="CCCCCC"/>
+            </w:tcBorders>
+          </w:tcPr>
+          <w:p>
+            <w:pPr>
+              <w:spacing w:before="40" w:after="40"/>
+            </w:pPr>
+            <w:r>
+              <w:rPr>
+                <w:sz w:val="18"/>
+              </w:rPr>
               <w:t>Browser localStorage</w:t>
             </w:r>
           </w:p>
@@ -18873,7 +21617,6 @@
               <w:bottom w:val="single" w:sz="4" w:space="0" w:color="CCCCCC"/>
               <w:right w:val="single" w:sz="4" w:space="0" w:color="CCCCCC"/>
             </w:tcBorders>
-            <w:shd w:val="clear" w:color="auto" w:fill="F0F4F8"/>
           </w:tcPr>
           <w:p>
             <w:pPr>

</xml_diff>

<commit_message>
docs: update specification to v1.2 with live traffic and multi-city heatmap
Bumps SPECIFICATION.md and .docx to v1.2. Documents Google Routes API
and TomTom Incidents API integration, city-aware portfolio heatmap,
new environment variables (GOOGLE_MAPS_SERVER_KEY, TOMTOM_API_KEY),
and revised Springfield/Abu Dhabi school rosters. Adds CHANGELOG entry
for 2026-03-01 (continued +2) summarizing live data features and fixes.

Co-Authored-By: Claude Sonnet 4.6 <noreply@anthropic.com>
</commit_message>
<xml_diff>
--- a/docs/SPECIFICATION.docx
+++ b/docs/SPECIFICATION.docx
@@ -5081,7 +5081,7 @@
               <w:rPr>
                 <w:sz w:val="18"/>
               </w:rPr>
-              <w:t>420</w:t>
+              <w:t>485</w:t>
             </w:r>
           </w:p>
         </w:tc>
@@ -5129,7 +5129,7 @@
               <w:rPr>
                 <w:sz w:val="18"/>
               </w:rPr>
-              <w:t>Roosevelt Middle School</w:t>
+              <w:t>Washington Middle School</w:t>
             </w:r>
           </w:p>
         </w:tc>
@@ -5175,7 +5175,7 @@
               <w:rPr>
                 <w:sz w:val="18"/>
               </w:rPr>
-              <w:t>610</w:t>
+              <w:t>720</w:t>
             </w:r>
           </w:p>
         </w:tc>
@@ -5265,7 +5265,7 @@
               <w:rPr>
                 <w:sz w:val="18"/>
               </w:rPr>
-              <w:t>1,050</w:t>
+              <w:t>1,100</w:t>
             </w:r>
           </w:p>
         </w:tc>
@@ -5313,7 +5313,7 @@
               <w:rPr>
                 <w:sz w:val="18"/>
               </w:rPr>
-              <w:t>Washington Elementary</w:t>
+              <w:t>Roosevelt Academy</w:t>
             </w:r>
           </w:p>
         </w:tc>
@@ -5359,7 +5359,7 @@
               <w:rPr>
                 <w:sz w:val="18"/>
               </w:rPr>
-              <w:t>385</w:t>
+              <w:t>320</w:t>
             </w:r>
           </w:p>
         </w:tc>
@@ -5405,7 +5405,7 @@
               <w:rPr>
                 <w:sz w:val="18"/>
               </w:rPr>
-              <w:t>Adams Middle School</w:t>
+              <w:t>Adams Preparatory</w:t>
             </w:r>
           </w:p>
         </w:tc>
@@ -5449,7 +5449,7 @@
               <w:rPr>
                 <w:sz w:val="18"/>
               </w:rPr>
-              <w:t>540</w:t>
+              <w:t>610</w:t>
             </w:r>
           </w:p>
         </w:tc>
@@ -5716,7 +5716,7 @@
               <w:rPr>
                 <w:sz w:val="18"/>
               </w:rPr>
-              <w:t>ADNOC Schools Khalifa</w:t>
+              <w:t>ADNOC Schools Khalifa City</w:t>
             </w:r>
           </w:p>
         </w:tc>
@@ -5808,7 +5808,7 @@
               <w:rPr>
                 <w:sz w:val="18"/>
               </w:rPr>
-              <w:t>Khalifa International Academy</w:t>
+              <w:t>Int'l School of Choueifat</w:t>
             </w:r>
           </w:p>
         </w:tc>
@@ -6119,7 +6119,7 @@
               <w:rPr>
                 <w:sz w:val="18"/>
               </w:rPr>
-              <w:t>Al Bateen Academy</w:t>
+              <w:t>Abu Dhabi Int'l School MBZ</w:t>
             </w:r>
           </w:p>
         </w:tc>
@@ -6211,7 +6211,7 @@
               <w:rPr>
                 <w:sz w:val="18"/>
               </w:rPr>
-              <w:t>Emirates National School</w:t>
+              <w:t>Emirates National School MBZ</w:t>
             </w:r>
           </w:p>
         </w:tc>
@@ -6262,6 +6262,135 @@
       </w:tr>
     </w:tbl>
     <w:p/>
+    <w:p>
+      <w:pPr>
+        <w:pStyle w:val="Heading4"/>
+      </w:pPr>
+      <w:r>
+        <w:rPr>
+          <w:b/>
+          <w:color w:val="445566"/>
+          <w:sz w:val="24"/>
+        </w:rPr>
+        <w:t>Live Traffic Data</w:t>
+      </w:r>
+    </w:p>
+    <w:p>
+      <w:pPr>
+        <w:spacing w:after="80"/>
+      </w:pPr>
+      <w:r>
+        <w:rPr>
+          <w:color w:val="1A1A2E"/>
+          <w:sz w:val="20"/>
+        </w:rPr>
+        <w:t xml:space="preserve">When in </w:t>
+      </w:r>
+      <w:r>
+        <w:rPr>
+          <w:b/>
+          <w:color w:val="1A1A2E"/>
+          <w:sz w:val="20"/>
+        </w:rPr>
+        <w:t>Live</w:t>
+      </w:r>
+      <w:r>
+        <w:rPr>
+          <w:color w:val="1A1A2E"/>
+          <w:sz w:val="20"/>
+        </w:rPr>
+        <w:t xml:space="preserve"> data mode, corridor congestion is supplemented by real-time data:</w:t>
+      </w:r>
+    </w:p>
+    <w:p>
+      <w:pPr>
+        <w:pStyle w:val="ListBullet"/>
+        <w:spacing w:after="40"/>
+        <w:ind w:left="360"/>
+      </w:pPr>
+      <w:r/>
+      <w:r>
+        <w:rPr>
+          <w:b/>
+        </w:rPr>
+        <w:t>Google Routes API</w:t>
+      </w:r>
+      <w:r>
+        <w:t xml:space="preserve"> — </w:t>
+      </w:r>
+      <w:r>
+        <w:rPr>
+          <w:rFonts w:ascii="Courier New" w:hAnsi="Courier New"/>
+          <w:color w:val="C7254E"/>
+          <w:sz w:val="18"/>
+        </w:rPr>
+        <w:t>/api/traffic/live?city=&lt;cityId&gt;</w:t>
+      </w:r>
+      <w:r>
+        <w:t xml:space="preserve"> calls </w:t>
+      </w:r>
+      <w:r>
+        <w:rPr>
+          <w:rFonts w:ascii="Courier New" w:hAnsi="Courier New"/>
+          <w:color w:val="C7254E"/>
+          <w:sz w:val="18"/>
+        </w:rPr>
+        <w:t>routes.googleapis.com/directions/v2:computeRoutes</w:t>
+      </w:r>
+      <w:r>
+        <w:t xml:space="preserve"> with </w:t>
+      </w:r>
+      <w:r>
+        <w:rPr>
+          <w:rFonts w:ascii="Courier New" w:hAnsi="Courier New"/>
+          <w:color w:val="C7254E"/>
+          <w:sz w:val="18"/>
+        </w:rPr>
+        <w:t>TRAFFIC_AWARE</w:t>
+      </w:r>
+      <w:r>
+        <w:t xml:space="preserve"> routing for each corridor. Congestion = </w:t>
+      </w:r>
+      <w:r>
+        <w:rPr>
+          <w:rFonts w:ascii="Courier New" w:hAnsi="Courier New"/>
+          <w:color w:val="C7254E"/>
+          <w:sz w:val="18"/>
+        </w:rPr>
+        <w:t>min(1, delaySec / staticSec)</w:t>
+      </w:r>
+      <w:r>
+        <w:t>. Results are cached server-side for 60 seconds.</w:t>
+      </w:r>
+    </w:p>
+    <w:p>
+      <w:pPr>
+        <w:pStyle w:val="ListBullet"/>
+        <w:spacing w:after="40"/>
+        <w:ind w:left="360"/>
+      </w:pPr>
+      <w:r/>
+      <w:r>
+        <w:rPr>
+          <w:b/>
+        </w:rPr>
+        <w:t>TomTom Incidents API</w:t>
+      </w:r>
+      <w:r>
+        <w:t xml:space="preserve"> — </w:t>
+      </w:r>
+      <w:r>
+        <w:rPr>
+          <w:rFonts w:ascii="Courier New" w:hAnsi="Courier New"/>
+          <w:color w:val="C7254E"/>
+          <w:sz w:val="18"/>
+        </w:rPr>
+        <w:t>/api/incidents/live?city=springfield_il</w:t>
+      </w:r>
+      <w:r>
+        <w:t xml:space="preserve"> fetches live incidents within the Springfield bounding box. In Demo mode or for non-Springfield cities, the synthetic incident data is used instead. Results are cached server-side for 5 minutes.</w:t>
+      </w:r>
+    </w:p>
     <w:p>
       <w:pPr>
         <w:pStyle w:val="Heading4"/>
@@ -7282,7 +7411,7 @@
         <w:rPr>
           <w:b/>
         </w:rPr>
-        <w:t>Risk source:</w:t>
+        <w:t>Risk source (Springfield):</w:t>
       </w:r>
       <w:r>
         <w:t xml:space="preserve"> </w:t>
@@ -7310,10 +7439,21 @@
         <w:rPr>
           <w:b/>
         </w:rPr>
-        <w:t>Card content:</w:t>
-      </w:r>
-      <w:r>
-        <w:t xml:space="preserve"> Zone name, risk value (0–100) per horizon, active intervention badge</w:t>
+        <w:t>Risk source (Abu Dhabi cities):</w:t>
+      </w:r>
+      <w:r>
+        <w:t xml:space="preserve"> Risk values generated from </w:t>
+      </w:r>
+      <w:r>
+        <w:rPr>
+          <w:rFonts w:ascii="Courier New" w:hAnsi="Courier New"/>
+          <w:color w:val="C7254E"/>
+          <w:sz w:val="18"/>
+        </w:rPr>
+        <w:t>getCongestionForCorridor()</w:t>
+      </w:r>
+      <w:r>
+        <w:t xml:space="preserve"> at the current minute-of-day ± offsets; city switches in real time alongside the Corridor Map</w:t>
       </w:r>
     </w:p>
     <w:p>
@@ -7327,10 +7467,44 @@
         <w:rPr>
           <w:b/>
         </w:rPr>
+        <w:t>Card content:</w:t>
+      </w:r>
+      <w:r>
+        <w:t xml:space="preserve"> Zone name, risk value (0–100) per horizon, active intervention badge</w:t>
+      </w:r>
+    </w:p>
+    <w:p>
+      <w:pPr>
+        <w:pStyle w:val="ListBullet"/>
+        <w:spacing w:after="40"/>
+        <w:ind w:left="360"/>
+      </w:pPr>
+      <w:r/>
+      <w:r>
+        <w:rPr>
+          <w:b/>
+        </w:rPr>
         <w:t>Color coding:</w:t>
       </w:r>
       <w:r>
-        <w:t xml:space="preserve"> Green (LOW), Amber (MED), Red (HIGH)</w:t>
+        <w:t xml:space="preserve"> Green (LOW ≤ 39), Amber (MED 40–59), Red (HIGH ≥ 60)</w:t>
+      </w:r>
+    </w:p>
+    <w:p>
+      <w:pPr>
+        <w:pStyle w:val="ListBullet"/>
+        <w:spacing w:after="40"/>
+        <w:ind w:left="360"/>
+      </w:pPr>
+      <w:r/>
+      <w:r>
+        <w:rPr>
+          <w:b/>
+        </w:rPr>
+        <w:t>City awareness:</w:t>
+      </w:r>
+      <w:r>
+        <w:t xml:space="preserve"> Heatmap cards reflect the selected city; switching the city picker on the Corridor Map immediately updates the heatmap to show the correct schools</w:t>
       </w:r>
     </w:p>
     <w:p>
@@ -14992,7 +15166,7 @@
           <w:color w:val="445566"/>
           <w:sz w:val="24"/>
         </w:rPr>
-        <w:t>GET `/api/incidents` — Fetch Incidents</w:t>
+        <w:t>GET `/api/incidents` — Fetch Incidents (Demo)</w:t>
       </w:r>
     </w:p>
     <w:tbl>
@@ -15457,6 +15631,780 @@
             </w:tcBorders>
           </w:tcPr>
           <w:p/>
+        </w:tc>
+      </w:tr>
+    </w:tbl>
+    <w:p/>
+    <w:p>
+      <w:pPr>
+        <w:pBdr>
+          <w:bottom w:val="single" w:sz="6" w:space="1" w:color="CCCCCC"/>
+        </w:pBdr>
+      </w:pPr>
+    </w:p>
+    <w:p>
+      <w:pPr>
+        <w:pStyle w:val="Heading3"/>
+      </w:pPr>
+      <w:r>
+        <w:rPr>
+          <w:b/>
+          <w:color w:val="445566"/>
+          <w:sz w:val="24"/>
+        </w:rPr>
+        <w:t>GET `/api/traffic/live` — Live Corridor Congestion</w:t>
+      </w:r>
+    </w:p>
+    <w:tbl>
+      <w:tblPr>
+        <w:tblStyle w:val="TableGrid"/>
+        <w:tblW w:type="auto" w:w="0"/>
+        <w:tblLook w:firstColumn="1" w:firstRow="1" w:lastColumn="0" w:lastRow="0" w:noHBand="0" w:noVBand="1" w:val="04A0"/>
+      </w:tblPr>
+      <w:tblGrid>
+        <w:gridCol w:w="4561"/>
+        <w:gridCol w:w="4561"/>
+      </w:tblGrid>
+      <w:tr>
+        <w:tc>
+          <w:tcPr>
+            <w:tcW w:type="dxa" w:w="4561"/>
+            <w:tcBorders>
+              <w:top w:val="single" w:sz="4" w:space="0" w:color="CCCCCC"/>
+              <w:left w:val="single" w:sz="4" w:space="0" w:color="CCCCCC"/>
+              <w:bottom w:val="single" w:sz="4" w:space="0" w:color="CCCCCC"/>
+              <w:right w:val="single" w:sz="4" w:space="0" w:color="CCCCCC"/>
+            </w:tcBorders>
+            <w:shd w:val="clear" w:color="auto" w:fill="1E3A5F"/>
+          </w:tcPr>
+          <w:p>
+            <w:pPr>
+              <w:spacing w:before="40" w:after="40"/>
+            </w:pPr>
+            <w:r>
+              <w:rPr>
+                <w:b/>
+                <w:color w:val="FFFFFF"/>
+                <w:sz w:val="18"/>
+              </w:rPr>
+            </w:r>
+          </w:p>
+        </w:tc>
+        <w:tc>
+          <w:tcPr>
+            <w:tcW w:type="dxa" w:w="4561"/>
+            <w:tcBorders>
+              <w:top w:val="single" w:sz="4" w:space="0" w:color="CCCCCC"/>
+              <w:left w:val="single" w:sz="4" w:space="0" w:color="CCCCCC"/>
+              <w:bottom w:val="single" w:sz="4" w:space="0" w:color="CCCCCC"/>
+              <w:right w:val="single" w:sz="4" w:space="0" w:color="CCCCCC"/>
+            </w:tcBorders>
+            <w:shd w:val="clear" w:color="auto" w:fill="1E3A5F"/>
+          </w:tcPr>
+          <w:p>
+            <w:pPr>
+              <w:spacing w:before="40" w:after="40"/>
+            </w:pPr>
+            <w:r>
+              <w:rPr>
+                <w:b/>
+                <w:color w:val="FFFFFF"/>
+                <w:sz w:val="18"/>
+              </w:rPr>
+            </w:r>
+          </w:p>
+        </w:tc>
+      </w:tr>
+      <w:tr>
+        <w:tc>
+          <w:tcPr>
+            <w:tcW w:type="dxa" w:w="4561"/>
+            <w:tcBorders>
+              <w:top w:val="single" w:sz="4" w:space="0" w:color="CCCCCC"/>
+              <w:left w:val="single" w:sz="4" w:space="0" w:color="CCCCCC"/>
+              <w:bottom w:val="single" w:sz="4" w:space="0" w:color="CCCCCC"/>
+              <w:right w:val="single" w:sz="4" w:space="0" w:color="CCCCCC"/>
+            </w:tcBorders>
+          </w:tcPr>
+          <w:p>
+            <w:pPr>
+              <w:spacing w:before="40" w:after="40"/>
+            </w:pPr>
+            <w:r>
+              <w:rPr>
+                <w:sz w:val="18"/>
+              </w:rPr>
+              <w:t>Auth</w:t>
+            </w:r>
+          </w:p>
+        </w:tc>
+        <w:tc>
+          <w:tcPr>
+            <w:tcW w:type="dxa" w:w="4561"/>
+            <w:tcBorders>
+              <w:top w:val="single" w:sz="4" w:space="0" w:color="CCCCCC"/>
+              <w:left w:val="single" w:sz="4" w:space="0" w:color="CCCCCC"/>
+              <w:bottom w:val="single" w:sz="4" w:space="0" w:color="CCCCCC"/>
+              <w:right w:val="single" w:sz="4" w:space="0" w:color="CCCCCC"/>
+            </w:tcBorders>
+          </w:tcPr>
+          <w:p>
+            <w:pPr>
+              <w:spacing w:before="40" w:after="40"/>
+            </w:pPr>
+            <w:r>
+              <w:rPr>
+                <w:sz w:val="18"/>
+              </w:rPr>
+              <w:t>None (server-side; requires Google Maps API key)</w:t>
+            </w:r>
+          </w:p>
+        </w:tc>
+      </w:tr>
+      <w:tr>
+        <w:tc>
+          <w:tcPr>
+            <w:tcW w:type="dxa" w:w="4561"/>
+            <w:tcBorders>
+              <w:top w:val="single" w:sz="4" w:space="0" w:color="CCCCCC"/>
+              <w:left w:val="single" w:sz="4" w:space="0" w:color="CCCCCC"/>
+              <w:bottom w:val="single" w:sz="4" w:space="0" w:color="CCCCCC"/>
+              <w:right w:val="single" w:sz="4" w:space="0" w:color="CCCCCC"/>
+            </w:tcBorders>
+            <w:shd w:val="clear" w:color="auto" w:fill="F0F4F8"/>
+          </w:tcPr>
+          <w:p>
+            <w:pPr>
+              <w:spacing w:before="40" w:after="40"/>
+            </w:pPr>
+            <w:r>
+              <w:rPr>
+                <w:sz w:val="18"/>
+              </w:rPr>
+              <w:t>Query params</w:t>
+            </w:r>
+          </w:p>
+        </w:tc>
+        <w:tc>
+          <w:tcPr>
+            <w:tcW w:type="dxa" w:w="4561"/>
+            <w:tcBorders>
+              <w:top w:val="single" w:sz="4" w:space="0" w:color="CCCCCC"/>
+              <w:left w:val="single" w:sz="4" w:space="0" w:color="CCCCCC"/>
+              <w:bottom w:val="single" w:sz="4" w:space="0" w:color="CCCCCC"/>
+              <w:right w:val="single" w:sz="4" w:space="0" w:color="CCCCCC"/>
+            </w:tcBorders>
+            <w:shd w:val="clear" w:color="auto" w:fill="F0F4F8"/>
+          </w:tcPr>
+          <w:p>
+            <w:pPr>
+              <w:spacing w:before="40" w:after="40"/>
+            </w:pPr>
+            <w:r>
+              <w:rPr>
+                <w:sz w:val="18"/>
+              </w:rPr>
+              <w:t>?city=&lt;cityId&gt; (default: springfield_il)</w:t>
+            </w:r>
+          </w:p>
+        </w:tc>
+      </w:tr>
+      <w:tr>
+        <w:tc>
+          <w:tcPr>
+            <w:tcW w:type="dxa" w:w="4561"/>
+            <w:tcBorders>
+              <w:top w:val="single" w:sz="4" w:space="0" w:color="CCCCCC"/>
+              <w:left w:val="single" w:sz="4" w:space="0" w:color="CCCCCC"/>
+              <w:bottom w:val="single" w:sz="4" w:space="0" w:color="CCCCCC"/>
+              <w:right w:val="single" w:sz="4" w:space="0" w:color="CCCCCC"/>
+            </w:tcBorders>
+          </w:tcPr>
+          <w:p>
+            <w:pPr>
+              <w:spacing w:before="40" w:after="40"/>
+            </w:pPr>
+            <w:r>
+              <w:rPr>
+                <w:sz w:val="18"/>
+              </w:rPr>
+              <w:t>Output</w:t>
+            </w:r>
+          </w:p>
+        </w:tc>
+        <w:tc>
+          <w:tcPr>
+            <w:tcW w:type="dxa" w:w="4561"/>
+            <w:tcBorders>
+              <w:top w:val="single" w:sz="4" w:space="0" w:color="CCCCCC"/>
+              <w:left w:val="single" w:sz="4" w:space="0" w:color="CCCCCC"/>
+              <w:bottom w:val="single" w:sz="4" w:space="0" w:color="CCCCCC"/>
+              <w:right w:val="single" w:sz="4" w:space="0" w:color="CCCCCC"/>
+            </w:tcBorders>
+          </w:tcPr>
+          <w:p>
+            <w:pPr>
+              <w:spacing w:before="40" w:after="40"/>
+            </w:pPr>
+            <w:r>
+              <w:rPr>
+                <w:sz w:val="18"/>
+              </w:rPr>
+              <w:t>{ city, zones: [{ zone_id, congestion, delay_seconds }], fetched_at }</w:t>
+            </w:r>
+          </w:p>
+        </w:tc>
+      </w:tr>
+      <w:tr>
+        <w:tc>
+          <w:tcPr>
+            <w:tcW w:type="dxa" w:w="4561"/>
+            <w:tcBorders>
+              <w:top w:val="single" w:sz="4" w:space="0" w:color="CCCCCC"/>
+              <w:left w:val="single" w:sz="4" w:space="0" w:color="CCCCCC"/>
+              <w:bottom w:val="single" w:sz="4" w:space="0" w:color="CCCCCC"/>
+              <w:right w:val="single" w:sz="4" w:space="0" w:color="CCCCCC"/>
+            </w:tcBorders>
+            <w:shd w:val="clear" w:color="auto" w:fill="F0F4F8"/>
+          </w:tcPr>
+          <w:p>
+            <w:pPr>
+              <w:spacing w:before="40" w:after="40"/>
+            </w:pPr>
+            <w:r>
+              <w:rPr>
+                <w:sz w:val="18"/>
+              </w:rPr>
+              <w:t>Cache</w:t>
+            </w:r>
+          </w:p>
+        </w:tc>
+        <w:tc>
+          <w:tcPr>
+            <w:tcW w:type="dxa" w:w="4561"/>
+            <w:tcBorders>
+              <w:top w:val="single" w:sz="4" w:space="0" w:color="CCCCCC"/>
+              <w:left w:val="single" w:sz="4" w:space="0" w:color="CCCCCC"/>
+              <w:bottom w:val="single" w:sz="4" w:space="0" w:color="CCCCCC"/>
+              <w:right w:val="single" w:sz="4" w:space="0" w:color="CCCCCC"/>
+            </w:tcBorders>
+            <w:shd w:val="clear" w:color="auto" w:fill="F0F4F8"/>
+          </w:tcPr>
+          <w:p>
+            <w:pPr>
+              <w:spacing w:before="40" w:after="40"/>
+            </w:pPr>
+            <w:r>
+              <w:rPr>
+                <w:sz w:val="18"/>
+              </w:rPr>
+              <w:t>60 seconds server-side per city</w:t>
+            </w:r>
+          </w:p>
+        </w:tc>
+      </w:tr>
+      <w:tr>
+        <w:tc>
+          <w:tcPr>
+            <w:tcW w:type="dxa" w:w="4561"/>
+            <w:tcBorders>
+              <w:top w:val="single" w:sz="4" w:space="0" w:color="CCCCCC"/>
+              <w:left w:val="single" w:sz="4" w:space="0" w:color="CCCCCC"/>
+              <w:bottom w:val="single" w:sz="4" w:space="0" w:color="CCCCCC"/>
+              <w:right w:val="single" w:sz="4" w:space="0" w:color="CCCCCC"/>
+            </w:tcBorders>
+          </w:tcPr>
+          <w:p>
+            <w:pPr>
+              <w:spacing w:before="40" w:after="40"/>
+            </w:pPr>
+            <w:r>
+              <w:rPr>
+                <w:sz w:val="18"/>
+              </w:rPr>
+              <w:t>Data source</w:t>
+            </w:r>
+          </w:p>
+        </w:tc>
+        <w:tc>
+          <w:tcPr>
+            <w:tcW w:type="dxa" w:w="4561"/>
+            <w:tcBorders>
+              <w:top w:val="single" w:sz="4" w:space="0" w:color="CCCCCC"/>
+              <w:left w:val="single" w:sz="4" w:space="0" w:color="CCCCCC"/>
+              <w:bottom w:val="single" w:sz="4" w:space="0" w:color="CCCCCC"/>
+              <w:right w:val="single" w:sz="4" w:space="0" w:color="CCCCCC"/>
+            </w:tcBorders>
+          </w:tcPr>
+          <w:p>
+            <w:pPr>
+              <w:spacing w:before="40" w:after="40"/>
+            </w:pPr>
+            <w:r>
+              <w:rPr>
+                <w:sz w:val="18"/>
+              </w:rPr>
+              <w:t>Google Routes API v2 (routes.googleapis.com) with TRAFFIC_AWARE routing</w:t>
+            </w:r>
+          </w:p>
+        </w:tc>
+      </w:tr>
+      <w:tr>
+        <w:tc>
+          <w:tcPr>
+            <w:tcW w:type="dxa" w:w="4561"/>
+            <w:tcBorders>
+              <w:top w:val="single" w:sz="4" w:space="0" w:color="CCCCCC"/>
+              <w:left w:val="single" w:sz="4" w:space="0" w:color="CCCCCC"/>
+              <w:bottom w:val="single" w:sz="4" w:space="0" w:color="CCCCCC"/>
+              <w:right w:val="single" w:sz="4" w:space="0" w:color="CCCCCC"/>
+            </w:tcBorders>
+            <w:shd w:val="clear" w:color="auto" w:fill="F0F4F8"/>
+          </w:tcPr>
+          <w:p>
+            <w:pPr>
+              <w:spacing w:before="40" w:after="40"/>
+            </w:pPr>
+            <w:r>
+              <w:rPr>
+                <w:sz w:val="18"/>
+              </w:rPr>
+              <w:t>Error</w:t>
+            </w:r>
+          </w:p>
+        </w:tc>
+        <w:tc>
+          <w:tcPr>
+            <w:tcW w:type="dxa" w:w="4561"/>
+            <w:tcBorders>
+              <w:top w:val="single" w:sz="4" w:space="0" w:color="CCCCCC"/>
+              <w:left w:val="single" w:sz="4" w:space="0" w:color="CCCCCC"/>
+              <w:bottom w:val="single" w:sz="4" w:space="0" w:color="CCCCCC"/>
+              <w:right w:val="single" w:sz="4" w:space="0" w:color="CCCCCC"/>
+            </w:tcBorders>
+            <w:shd w:val="clear" w:color="auto" w:fill="F0F4F8"/>
+          </w:tcPr>
+          <w:p>
+            <w:pPr>
+              <w:spacing w:before="40" w:after="40"/>
+            </w:pPr>
+            <w:r>
+              <w:rPr>
+                <w:sz w:val="18"/>
+              </w:rPr>
+              <w:t>{ error: "Maps API key not configured" } (503) if no key present</w:t>
+            </w:r>
+          </w:p>
+        </w:tc>
+      </w:tr>
+    </w:tbl>
+    <w:p/>
+    <w:p>
+      <w:pPr>
+        <w:pBdr>
+          <w:bottom w:val="single" w:sz="6" w:space="1" w:color="CCCCCC"/>
+        </w:pBdr>
+      </w:pPr>
+    </w:p>
+    <w:p>
+      <w:pPr>
+        <w:pStyle w:val="Heading3"/>
+      </w:pPr>
+      <w:r>
+        <w:rPr>
+          <w:b/>
+          <w:color w:val="445566"/>
+          <w:sz w:val="24"/>
+        </w:rPr>
+        <w:t>GET `/api/incidents/live` — Live Incident Data</w:t>
+      </w:r>
+    </w:p>
+    <w:tbl>
+      <w:tblPr>
+        <w:tblStyle w:val="TableGrid"/>
+        <w:tblW w:type="auto" w:w="0"/>
+        <w:tblLook w:firstColumn="1" w:firstRow="1" w:lastColumn="0" w:lastRow="0" w:noHBand="0" w:noVBand="1" w:val="04A0"/>
+      </w:tblPr>
+      <w:tblGrid>
+        <w:gridCol w:w="4561"/>
+        <w:gridCol w:w="4561"/>
+      </w:tblGrid>
+      <w:tr>
+        <w:tc>
+          <w:tcPr>
+            <w:tcW w:type="dxa" w:w="4561"/>
+            <w:tcBorders>
+              <w:top w:val="single" w:sz="4" w:space="0" w:color="CCCCCC"/>
+              <w:left w:val="single" w:sz="4" w:space="0" w:color="CCCCCC"/>
+              <w:bottom w:val="single" w:sz="4" w:space="0" w:color="CCCCCC"/>
+              <w:right w:val="single" w:sz="4" w:space="0" w:color="CCCCCC"/>
+            </w:tcBorders>
+            <w:shd w:val="clear" w:color="auto" w:fill="1E3A5F"/>
+          </w:tcPr>
+          <w:p>
+            <w:pPr>
+              <w:spacing w:before="40" w:after="40"/>
+            </w:pPr>
+            <w:r>
+              <w:rPr>
+                <w:b/>
+                <w:color w:val="FFFFFF"/>
+                <w:sz w:val="18"/>
+              </w:rPr>
+            </w:r>
+          </w:p>
+        </w:tc>
+        <w:tc>
+          <w:tcPr>
+            <w:tcW w:type="dxa" w:w="4561"/>
+            <w:tcBorders>
+              <w:top w:val="single" w:sz="4" w:space="0" w:color="CCCCCC"/>
+              <w:left w:val="single" w:sz="4" w:space="0" w:color="CCCCCC"/>
+              <w:bottom w:val="single" w:sz="4" w:space="0" w:color="CCCCCC"/>
+              <w:right w:val="single" w:sz="4" w:space="0" w:color="CCCCCC"/>
+            </w:tcBorders>
+            <w:shd w:val="clear" w:color="auto" w:fill="1E3A5F"/>
+          </w:tcPr>
+          <w:p>
+            <w:pPr>
+              <w:spacing w:before="40" w:after="40"/>
+            </w:pPr>
+            <w:r>
+              <w:rPr>
+                <w:b/>
+                <w:color w:val="FFFFFF"/>
+                <w:sz w:val="18"/>
+              </w:rPr>
+            </w:r>
+          </w:p>
+        </w:tc>
+      </w:tr>
+      <w:tr>
+        <w:tc>
+          <w:tcPr>
+            <w:tcW w:type="dxa" w:w="4561"/>
+            <w:tcBorders>
+              <w:top w:val="single" w:sz="4" w:space="0" w:color="CCCCCC"/>
+              <w:left w:val="single" w:sz="4" w:space="0" w:color="CCCCCC"/>
+              <w:bottom w:val="single" w:sz="4" w:space="0" w:color="CCCCCC"/>
+              <w:right w:val="single" w:sz="4" w:space="0" w:color="CCCCCC"/>
+            </w:tcBorders>
+          </w:tcPr>
+          <w:p>
+            <w:pPr>
+              <w:spacing w:before="40" w:after="40"/>
+            </w:pPr>
+            <w:r>
+              <w:rPr>
+                <w:sz w:val="18"/>
+              </w:rPr>
+              <w:t>Auth</w:t>
+            </w:r>
+          </w:p>
+        </w:tc>
+        <w:tc>
+          <w:tcPr>
+            <w:tcW w:type="dxa" w:w="4561"/>
+            <w:tcBorders>
+              <w:top w:val="single" w:sz="4" w:space="0" w:color="CCCCCC"/>
+              <w:left w:val="single" w:sz="4" w:space="0" w:color="CCCCCC"/>
+              <w:bottom w:val="single" w:sz="4" w:space="0" w:color="CCCCCC"/>
+              <w:right w:val="single" w:sz="4" w:space="0" w:color="CCCCCC"/>
+            </w:tcBorders>
+          </w:tcPr>
+          <w:p>
+            <w:pPr>
+              <w:spacing w:before="40" w:after="40"/>
+            </w:pPr>
+            <w:r>
+              <w:rPr>
+                <w:sz w:val="18"/>
+              </w:rPr>
+              <w:t>None (server-side; requires TOMTOM_API_KEY)</w:t>
+            </w:r>
+          </w:p>
+        </w:tc>
+      </w:tr>
+      <w:tr>
+        <w:tc>
+          <w:tcPr>
+            <w:tcW w:type="dxa" w:w="4561"/>
+            <w:tcBorders>
+              <w:top w:val="single" w:sz="4" w:space="0" w:color="CCCCCC"/>
+              <w:left w:val="single" w:sz="4" w:space="0" w:color="CCCCCC"/>
+              <w:bottom w:val="single" w:sz="4" w:space="0" w:color="CCCCCC"/>
+              <w:right w:val="single" w:sz="4" w:space="0" w:color="CCCCCC"/>
+            </w:tcBorders>
+            <w:shd w:val="clear" w:color="auto" w:fill="F0F4F8"/>
+          </w:tcPr>
+          <w:p>
+            <w:pPr>
+              <w:spacing w:before="40" w:after="40"/>
+            </w:pPr>
+            <w:r>
+              <w:rPr>
+                <w:sz w:val="18"/>
+              </w:rPr>
+              <w:t>Query params</w:t>
+            </w:r>
+          </w:p>
+        </w:tc>
+        <w:tc>
+          <w:tcPr>
+            <w:tcW w:type="dxa" w:w="4561"/>
+            <w:tcBorders>
+              <w:top w:val="single" w:sz="4" w:space="0" w:color="CCCCCC"/>
+              <w:left w:val="single" w:sz="4" w:space="0" w:color="CCCCCC"/>
+              <w:bottom w:val="single" w:sz="4" w:space="0" w:color="CCCCCC"/>
+              <w:right w:val="single" w:sz="4" w:space="0" w:color="CCCCCC"/>
+            </w:tcBorders>
+            <w:shd w:val="clear" w:color="auto" w:fill="F0F4F8"/>
+          </w:tcPr>
+          <w:p>
+            <w:pPr>
+              <w:spacing w:before="40" w:after="40"/>
+            </w:pPr>
+            <w:r>
+              <w:rPr>
+                <w:sz w:val="18"/>
+              </w:rPr>
+              <w:t>?city=&lt;cityId&gt;</w:t>
+            </w:r>
+          </w:p>
+        </w:tc>
+      </w:tr>
+      <w:tr>
+        <w:tc>
+          <w:tcPr>
+            <w:tcW w:type="dxa" w:w="4561"/>
+            <w:tcBorders>
+              <w:top w:val="single" w:sz="4" w:space="0" w:color="CCCCCC"/>
+              <w:left w:val="single" w:sz="4" w:space="0" w:color="CCCCCC"/>
+              <w:bottom w:val="single" w:sz="4" w:space="0" w:color="CCCCCC"/>
+              <w:right w:val="single" w:sz="4" w:space="0" w:color="CCCCCC"/>
+            </w:tcBorders>
+          </w:tcPr>
+          <w:p>
+            <w:pPr>
+              <w:spacing w:before="40" w:after="40"/>
+            </w:pPr>
+            <w:r>
+              <w:rPr>
+                <w:sz w:val="18"/>
+              </w:rPr>
+              <w:t>Output</w:t>
+            </w:r>
+          </w:p>
+        </w:tc>
+        <w:tc>
+          <w:tcPr>
+            <w:tcW w:type="dxa" w:w="4561"/>
+            <w:tcBorders>
+              <w:top w:val="single" w:sz="4" w:space="0" w:color="CCCCCC"/>
+              <w:left w:val="single" w:sz="4" w:space="0" w:color="CCCCCC"/>
+              <w:bottom w:val="single" w:sz="4" w:space="0" w:color="CCCCCC"/>
+              <w:right w:val="single" w:sz="4" w:space="0" w:color="CCCCCC"/>
+            </w:tcBorders>
+          </w:tcPr>
+          <w:p>
+            <w:pPr>
+              <w:spacing w:before="40" w:after="40"/>
+            </w:pPr>
+            <w:r>
+              <w:rPr>
+                <w:sz w:val="18"/>
+              </w:rPr>
+              <w:t>MappedIncident[] or { error: string }</w:t>
+            </w:r>
+          </w:p>
+        </w:tc>
+      </w:tr>
+      <w:tr>
+        <w:tc>
+          <w:tcPr>
+            <w:tcW w:type="dxa" w:w="4561"/>
+            <w:tcBorders>
+              <w:top w:val="single" w:sz="4" w:space="0" w:color="CCCCCC"/>
+              <w:left w:val="single" w:sz="4" w:space="0" w:color="CCCCCC"/>
+              <w:bottom w:val="single" w:sz="4" w:space="0" w:color="CCCCCC"/>
+              <w:right w:val="single" w:sz="4" w:space="0" w:color="CCCCCC"/>
+            </w:tcBorders>
+            <w:shd w:val="clear" w:color="auto" w:fill="F0F4F8"/>
+          </w:tcPr>
+          <w:p>
+            <w:pPr>
+              <w:spacing w:before="40" w:after="40"/>
+            </w:pPr>
+            <w:r>
+              <w:rPr>
+                <w:sz w:val="18"/>
+              </w:rPr>
+              <w:t>Cache</w:t>
+            </w:r>
+          </w:p>
+        </w:tc>
+        <w:tc>
+          <w:tcPr>
+            <w:tcW w:type="dxa" w:w="4561"/>
+            <w:tcBorders>
+              <w:top w:val="single" w:sz="4" w:space="0" w:color="CCCCCC"/>
+              <w:left w:val="single" w:sz="4" w:space="0" w:color="CCCCCC"/>
+              <w:bottom w:val="single" w:sz="4" w:space="0" w:color="CCCCCC"/>
+              <w:right w:val="single" w:sz="4" w:space="0" w:color="CCCCCC"/>
+            </w:tcBorders>
+            <w:shd w:val="clear" w:color="auto" w:fill="F0F4F8"/>
+          </w:tcPr>
+          <w:p>
+            <w:pPr>
+              <w:spacing w:before="40" w:after="40"/>
+            </w:pPr>
+            <w:r>
+              <w:rPr>
+                <w:sz w:val="18"/>
+              </w:rPr>
+              <w:t>5 minutes server-side</w:t>
+            </w:r>
+          </w:p>
+        </w:tc>
+      </w:tr>
+      <w:tr>
+        <w:tc>
+          <w:tcPr>
+            <w:tcW w:type="dxa" w:w="4561"/>
+            <w:tcBorders>
+              <w:top w:val="single" w:sz="4" w:space="0" w:color="CCCCCC"/>
+              <w:left w:val="single" w:sz="4" w:space="0" w:color="CCCCCC"/>
+              <w:bottom w:val="single" w:sz="4" w:space="0" w:color="CCCCCC"/>
+              <w:right w:val="single" w:sz="4" w:space="0" w:color="CCCCCC"/>
+            </w:tcBorders>
+          </w:tcPr>
+          <w:p>
+            <w:pPr>
+              <w:spacing w:before="40" w:after="40"/>
+            </w:pPr>
+            <w:r>
+              <w:rPr>
+                <w:sz w:val="18"/>
+              </w:rPr>
+              <w:t>Data source</w:t>
+            </w:r>
+          </w:p>
+        </w:tc>
+        <w:tc>
+          <w:tcPr>
+            <w:tcW w:type="dxa" w:w="4561"/>
+            <w:tcBorders>
+              <w:top w:val="single" w:sz="4" w:space="0" w:color="CCCCCC"/>
+              <w:left w:val="single" w:sz="4" w:space="0" w:color="CCCCCC"/>
+              <w:bottom w:val="single" w:sz="4" w:space="0" w:color="CCCCCC"/>
+              <w:right w:val="single" w:sz="4" w:space="0" w:color="CCCCCC"/>
+            </w:tcBorders>
+          </w:tcPr>
+          <w:p>
+            <w:pPr>
+              <w:spacing w:before="40" w:after="40"/>
+            </w:pPr>
+            <w:r>
+              <w:rPr>
+                <w:sz w:val="18"/>
+              </w:rPr>
+              <w:t>TomTom Traffic Incidents API v5</w:t>
+            </w:r>
+          </w:p>
+        </w:tc>
+      </w:tr>
+      <w:tr>
+        <w:tc>
+          <w:tcPr>
+            <w:tcW w:type="dxa" w:w="4561"/>
+            <w:tcBorders>
+              <w:top w:val="single" w:sz="4" w:space="0" w:color="CCCCCC"/>
+              <w:left w:val="single" w:sz="4" w:space="0" w:color="CCCCCC"/>
+              <w:bottom w:val="single" w:sz="4" w:space="0" w:color="CCCCCC"/>
+              <w:right w:val="single" w:sz="4" w:space="0" w:color="CCCCCC"/>
+            </w:tcBorders>
+            <w:shd w:val="clear" w:color="auto" w:fill="F0F4F8"/>
+          </w:tcPr>
+          <w:p>
+            <w:pPr>
+              <w:spacing w:before="40" w:after="40"/>
+            </w:pPr>
+            <w:r>
+              <w:rPr>
+                <w:sz w:val="18"/>
+              </w:rPr>
+              <w:t>Constraint</w:t>
+            </w:r>
+          </w:p>
+        </w:tc>
+        <w:tc>
+          <w:tcPr>
+            <w:tcW w:type="dxa" w:w="4561"/>
+            <w:tcBorders>
+              <w:top w:val="single" w:sz="4" w:space="0" w:color="CCCCCC"/>
+              <w:left w:val="single" w:sz="4" w:space="0" w:color="CCCCCC"/>
+              <w:bottom w:val="single" w:sz="4" w:space="0" w:color="CCCCCC"/>
+              <w:right w:val="single" w:sz="4" w:space="0" w:color="CCCCCC"/>
+            </w:tcBorders>
+            <w:shd w:val="clear" w:color="auto" w:fill="F0F4F8"/>
+          </w:tcPr>
+          <w:p>
+            <w:pPr>
+              <w:spacing w:before="40" w:after="40"/>
+            </w:pPr>
+            <w:r>
+              <w:rPr>
+                <w:sz w:val="18"/>
+              </w:rPr>
+              <w:t>Only populated for city=springfield_il; returns [] for other cities</w:t>
+            </w:r>
+          </w:p>
+        </w:tc>
+      </w:tr>
+      <w:tr>
+        <w:tc>
+          <w:tcPr>
+            <w:tcW w:type="dxa" w:w="4561"/>
+            <w:tcBorders>
+              <w:top w:val="single" w:sz="4" w:space="0" w:color="CCCCCC"/>
+              <w:left w:val="single" w:sz="4" w:space="0" w:color="CCCCCC"/>
+              <w:bottom w:val="single" w:sz="4" w:space="0" w:color="CCCCCC"/>
+              <w:right w:val="single" w:sz="4" w:space="0" w:color="CCCCCC"/>
+            </w:tcBorders>
+          </w:tcPr>
+          <w:p>
+            <w:pPr>
+              <w:spacing w:before="40" w:after="40"/>
+            </w:pPr>
+            <w:r>
+              <w:rPr>
+                <w:sz w:val="18"/>
+              </w:rPr>
+              <w:t>Error</w:t>
+            </w:r>
+          </w:p>
+        </w:tc>
+        <w:tc>
+          <w:tcPr>
+            <w:tcW w:type="dxa" w:w="4561"/>
+            <w:tcBorders>
+              <w:top w:val="single" w:sz="4" w:space="0" w:color="CCCCCC"/>
+              <w:left w:val="single" w:sz="4" w:space="0" w:color="CCCCCC"/>
+              <w:bottom w:val="single" w:sz="4" w:space="0" w:color="CCCCCC"/>
+              <w:right w:val="single" w:sz="4" w:space="0" w:color="CCCCCC"/>
+            </w:tcBorders>
+          </w:tcPr>
+          <w:p>
+            <w:pPr>
+              <w:spacing w:before="40" w:after="40"/>
+            </w:pPr>
+            <w:r>
+              <w:rPr>
+                <w:sz w:val="18"/>
+              </w:rPr>
+              <w:t>{ error: "TOMTOM_API_KEY not configured" } (503) if key missing</w:t>
+            </w:r>
+          </w:p>
         </w:tc>
       </w:tr>
     </w:tbl>
@@ -18391,6 +19339,458 @@
       </w:r>
       <w:r>
         <w:t xml:space="preserve"> to disable LLM calls)</w:t>
+      </w:r>
+    </w:p>
+    <w:p>
+      <w:pPr>
+        <w:pStyle w:val="Heading3"/>
+      </w:pPr>
+      <w:r>
+        <w:rPr>
+          <w:b/>
+          <w:color w:val="445566"/>
+          <w:sz w:val="24"/>
+        </w:rPr>
+        <w:t>Google Routes API</w:t>
+      </w:r>
+    </w:p>
+    <w:p>
+      <w:pPr>
+        <w:pStyle w:val="ListBullet"/>
+        <w:spacing w:after="40"/>
+        <w:ind w:left="360"/>
+      </w:pPr>
+      <w:r/>
+      <w:r>
+        <w:rPr>
+          <w:b/>
+        </w:rPr>
+        <w:t>Endpoint:</w:t>
+      </w:r>
+      <w:r>
+        <w:t xml:space="preserve"> </w:t>
+      </w:r>
+      <w:r>
+        <w:rPr>
+          <w:rFonts w:ascii="Courier New" w:hAnsi="Courier New"/>
+          <w:color w:val="C7254E"/>
+          <w:sz w:val="18"/>
+        </w:rPr>
+        <w:t>https://routes.googleapis.com/directions/v2:computeRoutes</w:t>
+      </w:r>
+      <w:r>
+        <w:t xml:space="preserve"> (POST)</w:t>
+      </w:r>
+    </w:p>
+    <w:p>
+      <w:pPr>
+        <w:pStyle w:val="ListBullet"/>
+        <w:spacing w:after="40"/>
+        <w:ind w:left="360"/>
+      </w:pPr>
+      <w:r/>
+      <w:r>
+        <w:rPr>
+          <w:b/>
+        </w:rPr>
+        <w:t>Env vars:</w:t>
+      </w:r>
+      <w:r>
+        <w:t xml:space="preserve"> </w:t>
+      </w:r>
+      <w:r>
+        <w:rPr>
+          <w:rFonts w:ascii="Courier New" w:hAnsi="Courier New"/>
+          <w:color w:val="C7254E"/>
+          <w:sz w:val="18"/>
+        </w:rPr>
+        <w:t>GOOGLE_MAPS_SERVER_KEY</w:t>
+      </w:r>
+      <w:r>
+        <w:t xml:space="preserve"> (preferred, server-only) or </w:t>
+      </w:r>
+      <w:r>
+        <w:rPr>
+          <w:rFonts w:ascii="Courier New" w:hAnsi="Courier New"/>
+          <w:color w:val="C7254E"/>
+          <w:sz w:val="18"/>
+        </w:rPr>
+        <w:t>NEXT_PUBLIC_GOOGLE_MAPS_API_KEY</w:t>
+      </w:r>
+      <w:r>
+        <w:t xml:space="preserve"> (fallback)</w:t>
+      </w:r>
+    </w:p>
+    <w:p>
+      <w:pPr>
+        <w:pStyle w:val="ListBullet"/>
+        <w:spacing w:after="40"/>
+        <w:ind w:left="360"/>
+      </w:pPr>
+      <w:r/>
+      <w:r>
+        <w:rPr>
+          <w:b/>
+        </w:rPr>
+        <w:t>Usage:</w:t>
+      </w:r>
+      <w:r>
+        <w:t xml:space="preserve"> Called server-side from </w:t>
+      </w:r>
+      <w:r>
+        <w:rPr>
+          <w:rFonts w:ascii="Courier New" w:hAnsi="Courier New"/>
+          <w:color w:val="C7254E"/>
+          <w:sz w:val="18"/>
+        </w:rPr>
+        <w:t>/api/traffic/live</w:t>
+      </w:r>
+      <w:r>
+        <w:t xml:space="preserve"> for each corridor; computes real-time congestion using </w:t>
+      </w:r>
+      <w:r>
+        <w:rPr>
+          <w:rFonts w:ascii="Courier New" w:hAnsi="Courier New"/>
+          <w:color w:val="C7254E"/>
+          <w:sz w:val="18"/>
+        </w:rPr>
+        <w:t>TRAFFIC_AWARE</w:t>
+      </w:r>
+      <w:r>
+        <w:t xml:space="preserve"> routing</w:t>
+      </w:r>
+    </w:p>
+    <w:p>
+      <w:pPr>
+        <w:pStyle w:val="ListBullet"/>
+        <w:spacing w:after="40"/>
+        <w:ind w:left="360"/>
+      </w:pPr>
+      <w:r/>
+      <w:r>
+        <w:rPr>
+          <w:b/>
+        </w:rPr>
+        <w:t>Required Google Cloud APIs:</w:t>
+      </w:r>
+      <w:r>
+        <w:t xml:space="preserve"> Routes API (in addition to Maps JavaScript API)</w:t>
+      </w:r>
+    </w:p>
+    <w:p>
+      <w:pPr>
+        <w:pStyle w:val="ListBullet"/>
+        <w:spacing w:after="40"/>
+        <w:ind w:left="360"/>
+      </w:pPr>
+      <w:r/>
+      <w:r>
+        <w:rPr>
+          <w:b/>
+        </w:rPr>
+        <w:t>Congestion formula:</w:t>
+      </w:r>
+      <w:r>
+        <w:t xml:space="preserve"> </w:t>
+      </w:r>
+      <w:r>
+        <w:rPr>
+          <w:rFonts w:ascii="Courier New" w:hAnsi="Courier New"/>
+          <w:color w:val="C7254E"/>
+          <w:sz w:val="18"/>
+        </w:rPr>
+        <w:t>congestion = min(1, (duration - staticDuration) / staticDuration)</w:t>
+      </w:r>
+      <w:r/>
+    </w:p>
+    <w:p>
+      <w:pPr>
+        <w:pStyle w:val="ListBullet"/>
+        <w:spacing w:after="40"/>
+        <w:ind w:left="360"/>
+      </w:pPr>
+      <w:r/>
+      <w:r>
+        <w:rPr>
+          <w:b/>
+        </w:rPr>
+        <w:t>Cache:</w:t>
+      </w:r>
+      <w:r>
+        <w:t xml:space="preserve"> 60-second module-level Map cache on the server; all corridors for a city fetched in parallel via </w:t>
+      </w:r>
+      <w:r>
+        <w:rPr>
+          <w:rFonts w:ascii="Courier New" w:hAnsi="Courier New"/>
+          <w:color w:val="C7254E"/>
+          <w:sz w:val="18"/>
+        </w:rPr>
+        <w:t>Promise.allSettled</w:t>
+      </w:r>
+      <w:r/>
+    </w:p>
+    <w:p>
+      <w:pPr>
+        <w:pStyle w:val="Heading3"/>
+      </w:pPr>
+      <w:r>
+        <w:rPr>
+          <w:b/>
+          <w:color w:val="445566"/>
+          <w:sz w:val="24"/>
+        </w:rPr>
+        <w:t>TomTom Traffic Incidents API</w:t>
+      </w:r>
+    </w:p>
+    <w:p>
+      <w:pPr>
+        <w:pStyle w:val="ListBullet"/>
+        <w:spacing w:after="40"/>
+        <w:ind w:left="360"/>
+      </w:pPr>
+      <w:r/>
+      <w:r>
+        <w:rPr>
+          <w:b/>
+        </w:rPr>
+        <w:t>Endpoint:</w:t>
+      </w:r>
+      <w:r>
+        <w:t xml:space="preserve"> </w:t>
+      </w:r>
+      <w:r>
+        <w:rPr>
+          <w:rFonts w:ascii="Courier New" w:hAnsi="Courier New"/>
+          <w:color w:val="C7254E"/>
+          <w:sz w:val="18"/>
+        </w:rPr>
+        <w:t>https://api.tomtom.com/traffic/services/5/incidentDetails</w:t>
+      </w:r>
+      <w:r>
+        <w:t xml:space="preserve"> (GET)</w:t>
+      </w:r>
+    </w:p>
+    <w:p>
+      <w:pPr>
+        <w:pStyle w:val="ListBullet"/>
+        <w:spacing w:after="40"/>
+        <w:ind w:left="360"/>
+      </w:pPr>
+      <w:r/>
+      <w:r>
+        <w:rPr>
+          <w:b/>
+        </w:rPr>
+        <w:t>Env var:</w:t>
+      </w:r>
+      <w:r>
+        <w:t xml:space="preserve"> </w:t>
+      </w:r>
+      <w:r>
+        <w:rPr>
+          <w:rFonts w:ascii="Courier New" w:hAnsi="Courier New"/>
+          <w:color w:val="C7254E"/>
+          <w:sz w:val="18"/>
+        </w:rPr>
+        <w:t>TOMTOM_API_KEY</w:t>
+      </w:r>
+      <w:r>
+        <w:t xml:space="preserve"> (server-side only)</w:t>
+      </w:r>
+    </w:p>
+    <w:p>
+      <w:pPr>
+        <w:pStyle w:val="ListBullet"/>
+        <w:spacing w:after="40"/>
+        <w:ind w:left="360"/>
+      </w:pPr>
+      <w:r/>
+      <w:r>
+        <w:rPr>
+          <w:b/>
+        </w:rPr>
+        <w:t>Usage:</w:t>
+      </w:r>
+      <w:r>
+        <w:t xml:space="preserve"> Called server-side from </w:t>
+      </w:r>
+      <w:r>
+        <w:rPr>
+          <w:rFonts w:ascii="Courier New" w:hAnsi="Courier New"/>
+          <w:color w:val="C7254E"/>
+          <w:sz w:val="18"/>
+        </w:rPr>
+        <w:t>/api/incidents/live</w:t>
+      </w:r>
+      <w:r>
+        <w:t xml:space="preserve"> for the Springfield, IL bounding box</w:t>
+      </w:r>
+    </w:p>
+    <w:p>
+      <w:pPr>
+        <w:pStyle w:val="ListBullet"/>
+        <w:spacing w:after="40"/>
+        <w:ind w:left="360"/>
+      </w:pPr>
+      <w:r/>
+      <w:r>
+        <w:rPr>
+          <w:b/>
+        </w:rPr>
+        <w:t>Fields fetched:</w:t>
+      </w:r>
+      <w:r>
+        <w:t xml:space="preserve"> </w:t>
+      </w:r>
+      <w:r>
+        <w:rPr>
+          <w:rFonts w:ascii="Courier New" w:hAnsi="Courier New"/>
+          <w:color w:val="C7254E"/>
+          <w:sz w:val="18"/>
+        </w:rPr>
+        <w:t>iconCategory</w:t>
+      </w:r>
+      <w:r>
+        <w:t xml:space="preserve">, </w:t>
+      </w:r>
+      <w:r>
+        <w:rPr>
+          <w:rFonts w:ascii="Courier New" w:hAnsi="Courier New"/>
+          <w:color w:val="C7254E"/>
+          <w:sz w:val="18"/>
+        </w:rPr>
+        <w:t>magnitudeOfDelay</w:t>
+      </w:r>
+      <w:r>
+        <w:t xml:space="preserve">, </w:t>
+      </w:r>
+      <w:r>
+        <w:rPr>
+          <w:rFonts w:ascii="Courier New" w:hAnsi="Courier New"/>
+          <w:color w:val="C7254E"/>
+          <w:sz w:val="18"/>
+        </w:rPr>
+        <w:t>events/description</w:t>
+      </w:r>
+      <w:r>
+        <w:t xml:space="preserve">, </w:t>
+      </w:r>
+      <w:r>
+        <w:rPr>
+          <w:rFonts w:ascii="Courier New" w:hAnsi="Courier New"/>
+          <w:color w:val="C7254E"/>
+          <w:sz w:val="18"/>
+        </w:rPr>
+        <w:t>startTime</w:t>
+      </w:r>
+      <w:r>
+        <w:t xml:space="preserve">, </w:t>
+      </w:r>
+      <w:r>
+        <w:rPr>
+          <w:rFonts w:ascii="Courier New" w:hAnsi="Courier New"/>
+          <w:color w:val="C7254E"/>
+          <w:sz w:val="18"/>
+        </w:rPr>
+        <w:t>from</w:t>
+      </w:r>
+      <w:r>
+        <w:t xml:space="preserve">, </w:t>
+      </w:r>
+      <w:r>
+        <w:rPr>
+          <w:rFonts w:ascii="Courier New" w:hAnsi="Courier New"/>
+          <w:color w:val="C7254E"/>
+          <w:sz w:val="18"/>
+        </w:rPr>
+        <w:t>to</w:t>
+      </w:r>
+      <w:r>
+        <w:t>, geometry</w:t>
+      </w:r>
+    </w:p>
+    <w:p>
+      <w:pPr>
+        <w:pStyle w:val="ListBullet"/>
+        <w:spacing w:after="40"/>
+        <w:ind w:left="360"/>
+      </w:pPr>
+      <w:r/>
+      <w:r>
+        <w:rPr>
+          <w:b/>
+        </w:rPr>
+        <w:t>Mapping:</w:t>
+      </w:r>
+      <w:r>
+        <w:t xml:space="preserve"> </w:t>
+      </w:r>
+      <w:r>
+        <w:rPr>
+          <w:rFonts w:ascii="Courier New" w:hAnsi="Courier New"/>
+          <w:color w:val="C7254E"/>
+          <w:sz w:val="18"/>
+        </w:rPr>
+        <w:t>iconCategory</w:t>
+      </w:r>
+      <w:r>
+        <w:t xml:space="preserve"> → incident type string and human label; </w:t>
+      </w:r>
+      <w:r>
+        <w:rPr>
+          <w:rFonts w:ascii="Courier New" w:hAnsi="Courier New"/>
+          <w:color w:val="C7254E"/>
+          <w:sz w:val="18"/>
+        </w:rPr>
+        <w:t>magnitudeOfDelay</w:t>
+      </w:r>
+      <w:r>
+        <w:t xml:space="preserve"> (0–4) → </w:t>
+      </w:r>
+      <w:r>
+        <w:rPr>
+          <w:rFonts w:ascii="Courier New" w:hAnsi="Courier New"/>
+          <w:color w:val="C7254E"/>
+          <w:sz w:val="18"/>
+        </w:rPr>
+        <w:t>RiskLevel</w:t>
+      </w:r>
+      <w:r>
+        <w:t xml:space="preserve"> (≥3 HIGH, ≥2 MED, else LOW)</w:t>
+      </w:r>
+    </w:p>
+    <w:p>
+      <w:pPr>
+        <w:pStyle w:val="ListBullet"/>
+        <w:spacing w:after="40"/>
+        <w:ind w:left="360"/>
+      </w:pPr>
+      <w:r/>
+      <w:r>
+        <w:rPr>
+          <w:b/>
+        </w:rPr>
+        <w:t>Zone assignment:</w:t>
+      </w:r>
+      <w:r>
+        <w:t xml:space="preserve"> Each incident is assigned to the nearest corridor school by Euclidean coordinate distance</w:t>
+      </w:r>
+    </w:p>
+    <w:p>
+      <w:pPr>
+        <w:pStyle w:val="ListBullet"/>
+        <w:spacing w:after="40"/>
+        <w:ind w:left="360"/>
+      </w:pPr>
+      <w:r/>
+      <w:r>
+        <w:rPr>
+          <w:b/>
+        </w:rPr>
+        <w:t>Cache:</w:t>
+      </w:r>
+      <w:r>
+        <w:t xml:space="preserve"> 5-minute module-level Map cache on the server</w:t>
       </w:r>
     </w:p>
     <w:p>
@@ -20541,7 +21941,191 @@
               <w:rPr>
                 <w:sz w:val="18"/>
               </w:rPr>
-              <w:t>Google Maps JavaScript API key</w:t>
+              <w:t>Google Maps JavaScript API key (Maps JavaScript API)</w:t>
+            </w:r>
+          </w:p>
+        </w:tc>
+      </w:tr>
+      <w:tr>
+        <w:tc>
+          <w:tcPr>
+            <w:tcW w:type="dxa" w:w="2280"/>
+            <w:tcBorders>
+              <w:top w:val="single" w:sz="4" w:space="0" w:color="CCCCCC"/>
+              <w:left w:val="single" w:sz="4" w:space="0" w:color="CCCCCC"/>
+              <w:bottom w:val="single" w:sz="4" w:space="0" w:color="CCCCCC"/>
+              <w:right w:val="single" w:sz="4" w:space="0" w:color="CCCCCC"/>
+            </w:tcBorders>
+            <w:shd w:val="clear" w:color="auto" w:fill="F0F4F8"/>
+          </w:tcPr>
+          <w:p>
+            <w:pPr>
+              <w:spacing w:before="40" w:after="40"/>
+            </w:pPr>
+            <w:r>
+              <w:rPr>
+                <w:sz w:val="18"/>
+              </w:rPr>
+              <w:t>GOOGLE_MAPS_SERVER_KEY</w:t>
+            </w:r>
+          </w:p>
+        </w:tc>
+        <w:tc>
+          <w:tcPr>
+            <w:tcW w:type="dxa" w:w="2280"/>
+            <w:tcBorders>
+              <w:top w:val="single" w:sz="4" w:space="0" w:color="CCCCCC"/>
+              <w:left w:val="single" w:sz="4" w:space="0" w:color="CCCCCC"/>
+              <w:bottom w:val="single" w:sz="4" w:space="0" w:color="CCCCCC"/>
+              <w:right w:val="single" w:sz="4" w:space="0" w:color="CCCCCC"/>
+            </w:tcBorders>
+            <w:shd w:val="clear" w:color="auto" w:fill="F0F4F8"/>
+          </w:tcPr>
+          <w:p>
+            <w:pPr>
+              <w:spacing w:before="40" w:after="40"/>
+            </w:pPr>
+            <w:r>
+              <w:rPr>
+                <w:sz w:val="18"/>
+              </w:rPr>
+              <w:t>No</w:t>
+            </w:r>
+          </w:p>
+        </w:tc>
+        <w:tc>
+          <w:tcPr>
+            <w:tcW w:type="dxa" w:w="2280"/>
+            <w:tcBorders>
+              <w:top w:val="single" w:sz="4" w:space="0" w:color="CCCCCC"/>
+              <w:left w:val="single" w:sz="4" w:space="0" w:color="CCCCCC"/>
+              <w:bottom w:val="single" w:sz="4" w:space="0" w:color="CCCCCC"/>
+              <w:right w:val="single" w:sz="4" w:space="0" w:color="CCCCCC"/>
+            </w:tcBorders>
+            <w:shd w:val="clear" w:color="auto" w:fill="F0F4F8"/>
+          </w:tcPr>
+          <w:p>
+            <w:pPr>
+              <w:spacing w:before="40" w:after="40"/>
+            </w:pPr>
+            <w:r>
+              <w:rPr>
+                <w:sz w:val="18"/>
+              </w:rPr>
+              <w:t>Server-only</w:t>
+            </w:r>
+          </w:p>
+        </w:tc>
+        <w:tc>
+          <w:tcPr>
+            <w:tcW w:type="dxa" w:w="2280"/>
+            <w:tcBorders>
+              <w:top w:val="single" w:sz="4" w:space="0" w:color="CCCCCC"/>
+              <w:left w:val="single" w:sz="4" w:space="0" w:color="CCCCCC"/>
+              <w:bottom w:val="single" w:sz="4" w:space="0" w:color="CCCCCC"/>
+              <w:right w:val="single" w:sz="4" w:space="0" w:color="CCCCCC"/>
+            </w:tcBorders>
+            <w:shd w:val="clear" w:color="auto" w:fill="F0F4F8"/>
+          </w:tcPr>
+          <w:p>
+            <w:pPr>
+              <w:spacing w:before="40" w:after="40"/>
+            </w:pPr>
+            <w:r>
+              <w:rPr>
+                <w:sz w:val="18"/>
+              </w:rPr>
+              <w:t>Google Maps key for Routes API calls; falls back to NEXT_PUBLIC_GOOGLE_MAPS_API_KEY if not set</w:t>
+            </w:r>
+          </w:p>
+        </w:tc>
+      </w:tr>
+      <w:tr>
+        <w:tc>
+          <w:tcPr>
+            <w:tcW w:type="dxa" w:w="2280"/>
+            <w:tcBorders>
+              <w:top w:val="single" w:sz="4" w:space="0" w:color="CCCCCC"/>
+              <w:left w:val="single" w:sz="4" w:space="0" w:color="CCCCCC"/>
+              <w:bottom w:val="single" w:sz="4" w:space="0" w:color="CCCCCC"/>
+              <w:right w:val="single" w:sz="4" w:space="0" w:color="CCCCCC"/>
+            </w:tcBorders>
+          </w:tcPr>
+          <w:p>
+            <w:pPr>
+              <w:spacing w:before="40" w:after="40"/>
+            </w:pPr>
+            <w:r>
+              <w:rPr>
+                <w:sz w:val="18"/>
+              </w:rPr>
+              <w:t>TOMTOM_API_KEY</w:t>
+            </w:r>
+          </w:p>
+        </w:tc>
+        <w:tc>
+          <w:tcPr>
+            <w:tcW w:type="dxa" w:w="2280"/>
+            <w:tcBorders>
+              <w:top w:val="single" w:sz="4" w:space="0" w:color="CCCCCC"/>
+              <w:left w:val="single" w:sz="4" w:space="0" w:color="CCCCCC"/>
+              <w:bottom w:val="single" w:sz="4" w:space="0" w:color="CCCCCC"/>
+              <w:right w:val="single" w:sz="4" w:space="0" w:color="CCCCCC"/>
+            </w:tcBorders>
+          </w:tcPr>
+          <w:p>
+            <w:pPr>
+              <w:spacing w:before="40" w:after="40"/>
+            </w:pPr>
+            <w:r>
+              <w:rPr>
+                <w:sz w:val="18"/>
+              </w:rPr>
+              <w:t>No†</w:t>
+            </w:r>
+          </w:p>
+        </w:tc>
+        <w:tc>
+          <w:tcPr>
+            <w:tcW w:type="dxa" w:w="2280"/>
+            <w:tcBorders>
+              <w:top w:val="single" w:sz="4" w:space="0" w:color="CCCCCC"/>
+              <w:left w:val="single" w:sz="4" w:space="0" w:color="CCCCCC"/>
+              <w:bottom w:val="single" w:sz="4" w:space="0" w:color="CCCCCC"/>
+              <w:right w:val="single" w:sz="4" w:space="0" w:color="CCCCCC"/>
+            </w:tcBorders>
+          </w:tcPr>
+          <w:p>
+            <w:pPr>
+              <w:spacing w:before="40" w:after="40"/>
+            </w:pPr>
+            <w:r>
+              <w:rPr>
+                <w:sz w:val="18"/>
+              </w:rPr>
+              <w:t>Server-only</w:t>
+            </w:r>
+          </w:p>
+        </w:tc>
+        <w:tc>
+          <w:tcPr>
+            <w:tcW w:type="dxa" w:w="2280"/>
+            <w:tcBorders>
+              <w:top w:val="single" w:sz="4" w:space="0" w:color="CCCCCC"/>
+              <w:left w:val="single" w:sz="4" w:space="0" w:color="CCCCCC"/>
+              <w:bottom w:val="single" w:sz="4" w:space="0" w:color="CCCCCC"/>
+              <w:right w:val="single" w:sz="4" w:space="0" w:color="CCCCCC"/>
+            </w:tcBorders>
+          </w:tcPr>
+          <w:p>
+            <w:pPr>
+              <w:spacing w:before="40" w:after="40"/>
+            </w:pPr>
+            <w:r>
+              <w:rPr>
+                <w:sz w:val="18"/>
+              </w:rPr>
+              <w:t>TomTom developer API key; required for live incident data in Springfield IL</w:t>
             </w:r>
           </w:p>
         </w:tc>
@@ -20836,6 +22420,18 @@
           <w:sz w:val="20"/>
         </w:rPr>
         <w:t>\* Required only for AI brief feature; all other features work without it.</w:t>
+      </w:r>
+    </w:p>
+    <w:p>
+      <w:pPr>
+        <w:spacing w:after="80"/>
+      </w:pPr>
+      <w:r>
+        <w:rPr>
+          <w:color w:val="1A1A2E"/>
+          <w:sz w:val="20"/>
+        </w:rPr>
+        <w:t>† Required only for live TomTom incident overlay; incidents fall back to synthetic demo data when not set.</w:t>
       </w:r>
     </w:p>
     <w:p>

</xml_diff>